<commit_message>
Expand unified mapping policy and integrate LME036 coverage
</commit_message>
<xml_diff>
--- a/tools/templates/Model_validation_template.docx
+++ b/tools/templates/Model_validation_template.docx
@@ -1084,827 +1084,6 @@
           </w:tcPr>
           <w:p>
             <w:pPr>
-              <w:spacing w:after="40" w:before="0" w:line="240" w:lineRule="auto"/>
-            </w:pPr>
-            <w:r>
-              <w:rPr>
-                <w:rFonts w:ascii="Calibri" w:hAnsi="Calibri"/>
-                <w:sz w:val="21"/>
-                <w:color w:val="000000"/>
-                <w:b/>
-              </w:rPr>
-              <w:t xml:space="preserve">Taxon mapping and coverage</w:t>
-            </w:r>
-          </w:p>
-        </w:tc>
-        <w:tc>
-          <w:tcPr>
-            <w:tcW w:type="dxa" w:w="7834"/>
-            <w:vAlign w:val="center"/>
-            <w:shd w:fill="FFFFFF"/>
-            <w:tcMar>
-              <w:top w:w="90" w:type="dxa"/>
-              <w:bottom w:w="90" w:type="dxa"/>
-              <w:left w:w="110" w:type="dxa"/>
-              <w:right w:w="110" w:type="dxa"/>
-            </w:tcMar>
-            <w:tcBorders>
-              <w:top w:val="single" w:sz="5" w:color="D9D9D9"/>
-              <w:left w:val="single" w:sz="5" w:color="D9D9D9"/>
-              <w:bottom w:val="single" w:sz="5" w:color="D9D9D9"/>
-              <w:right w:val="single" w:sz="5" w:color="D9D9D9"/>
-            </w:tcBorders>
-          </w:tcPr>
-          <w:p>
-            <w:pPr>
-              <w:spacing w:after="40" w:before="0" w:line="240" w:lineRule="auto"/>
-            </w:pPr>
-            <w:r>
-              <w:rPr>
-                <w:rFonts w:ascii="Calibri" w:hAnsi="Calibri"/>
-                <w:sz w:val="21"/>
-                <w:color w:val="000000"/>
-              </w:rPr>
-              <w:t xml:space="preserve">Reference: [year]; [catch basis].</w:t>
-            </w:r>
-          </w:p>
-          <w:p>
-            <w:pPr>
-              <w:spacing w:after="40" w:before="0" w:line="240" w:lineRule="auto"/>
-            </w:pPr>
-            <w:r>
-              <w:rPr>
-                <w:rFonts w:ascii="Calibri" w:hAnsi="Calibri"/>
-                <w:sz w:val="21"/>
-                <w:color w:val="000000"/>
-              </w:rPr>
-              <w:t xml:space="preserve">Groups: [n]; catch taxa: [n].</w:t>
-            </w:r>
-          </w:p>
-          <w:p>
-            <w:pPr>
-              <w:spacing w:after="40" w:before="0" w:line="240" w:lineRule="auto"/>
-            </w:pPr>
-            <w:r>
-              <w:rPr>
-                <w:rFonts w:ascii="Calibri" w:hAnsi="Calibri"/>
-                <w:sz w:val="21"/>
-                <w:color w:val="000000"/>
-              </w:rPr>
-              <w:t xml:space="preserve">Catch: [t]; simple-chain PPR: [t C].</w:t>
-            </w:r>
-          </w:p>
-          <w:tbl>
-            <w:tblPr>
-              <w:tblW w:type="dxa" w:w="7474"/>
-              <w:jc w:val="center"/>
-              <w:tblLayout w:type="fixed"/>
-              <w:tblLook w:firstColumn="1" w:firstRow="1" w:lastColumn="0" w:lastRow="0" w:noHBand="0" w:noVBand="1" w:val="04A0"/>
-            </w:tblPr>
-            <w:tblGrid>
-              <w:gridCol w:w="2100"/>
-              <w:gridCol w:w="1120"/>
-              <w:gridCol w:w="1700"/>
-              <w:gridCol w:w="2554"/>
-            </w:tblGrid>
-            <w:tr>
-              <w:trPr>
-                <w:cantSplit/>
-                <w:tblHeader/>
-              </w:trPr>
-              <w:tc>
-                <w:tcPr>
-                  <w:tcW w:type="dxa" w:w="2100"/>
-                  <w:vAlign w:val="center"/>
-                  <w:shd w:fill="E5ECF0"/>
-                  <w:tcMar>
-                    <w:top w:w="90" w:type="dxa"/>
-                    <w:bottom w:w="90" w:type="dxa"/>
-                    <w:left w:w="110" w:type="dxa"/>
-                    <w:right w:w="110" w:type="dxa"/>
-                  </w:tcMar>
-                  <w:tcBorders>
-                    <w:top w:val="single" w:sz="5" w:color="D9D9D9"/>
-                    <w:left w:val="single" w:sz="5" w:color="D9D9D9"/>
-                    <w:bottom w:val="single" w:sz="5" w:color="D9D9D9"/>
-                    <w:right w:val="single" w:sz="5" w:color="D9D9D9"/>
-                  </w:tcBorders>
-                </w:tcPr>
-                <w:p>
-                  <w:pPr>
-                    <w:spacing w:after="40" w:before="0" w:line="240" w:lineRule="auto"/>
-                  </w:pPr>
-                  <w:r>
-                    <w:rPr>
-                      <w:rFonts w:ascii="Calibri" w:hAnsi="Calibri"/>
-                      <w:sz w:val="19"/>
-                      <w:color w:val="000000"/>
-                      <w:b/>
-                    </w:rPr>
-                    <w:t xml:space="preserve">Confidence</w:t>
-                  </w:r>
-                </w:p>
-              </w:tc>
-              <w:tc>
-                <w:tcPr>
-                  <w:tcW w:type="dxa" w:w="1120"/>
-                  <w:vAlign w:val="center"/>
-                  <w:shd w:fill="E5ECF0"/>
-                  <w:tcMar>
-                    <w:top w:w="90" w:type="dxa"/>
-                    <w:bottom w:w="90" w:type="dxa"/>
-                    <w:left w:w="110" w:type="dxa"/>
-                    <w:right w:w="110" w:type="dxa"/>
-                  </w:tcMar>
-                  <w:tcBorders>
-                    <w:top w:val="single" w:sz="5" w:color="D9D9D9"/>
-                    <w:left w:val="single" w:sz="5" w:color="D9D9D9"/>
-                    <w:bottom w:val="single" w:sz="5" w:color="D9D9D9"/>
-                    <w:right w:val="single" w:sz="5" w:color="D9D9D9"/>
-                  </w:tcBorders>
-                </w:tcPr>
-                <w:p>
-                  <w:pPr>
-                    <w:spacing w:after="40" w:before="0" w:line="240" w:lineRule="auto"/>
-                  </w:pPr>
-                  <w:r>
-                    <w:rPr>
-                      <w:rFonts w:ascii="Calibri" w:hAnsi="Calibri"/>
-                      <w:sz w:val="19"/>
-                      <w:color w:val="000000"/>
-                      <w:b/>
-                    </w:rPr>
-                    <w:t xml:space="preserve">Taxa (n)</w:t>
-                  </w:r>
-                </w:p>
-              </w:tc>
-              <w:tc>
-                <w:tcPr>
-                  <w:tcW w:type="dxa" w:w="1700"/>
-                  <w:vAlign w:val="center"/>
-                  <w:shd w:fill="E5ECF0"/>
-                  <w:tcMar>
-                    <w:top w:w="90" w:type="dxa"/>
-                    <w:bottom w:w="90" w:type="dxa"/>
-                    <w:left w:w="110" w:type="dxa"/>
-                    <w:right w:w="110" w:type="dxa"/>
-                  </w:tcMar>
-                  <w:tcBorders>
-                    <w:top w:val="single" w:sz="5" w:color="D9D9D9"/>
-                    <w:left w:val="single" w:sz="5" w:color="D9D9D9"/>
-                    <w:bottom w:val="single" w:sz="5" w:color="D9D9D9"/>
-                    <w:right w:val="single" w:sz="5" w:color="D9D9D9"/>
-                  </w:tcBorders>
-                </w:tcPr>
-                <w:p>
-                  <w:pPr>
-                    <w:spacing w:after="40" w:before="0" w:line="240" w:lineRule="auto"/>
-                  </w:pPr>
-                  <w:r>
-                    <w:rPr>
-                      <w:rFonts w:ascii="Calibri" w:hAnsi="Calibri"/>
-                      <w:sz w:val="19"/>
-                      <w:color w:val="000000"/>
-                      <w:b/>
-                    </w:rPr>
-                    <w:t xml:space="preserve">Catch (%)</w:t>
-                  </w:r>
-                </w:p>
-              </w:tc>
-              <w:tc>
-                <w:tcPr>
-                  <w:tcW w:type="dxa" w:w="2554"/>
-                  <w:vAlign w:val="center"/>
-                  <w:shd w:fill="E5ECF0"/>
-                  <w:tcMar>
-                    <w:top w:w="90" w:type="dxa"/>
-                    <w:bottom w:w="90" w:type="dxa"/>
-                    <w:left w:w="110" w:type="dxa"/>
-                    <w:right w:w="110" w:type="dxa"/>
-                  </w:tcMar>
-                  <w:tcBorders>
-                    <w:top w:val="single" w:sz="5" w:color="D9D9D9"/>
-                    <w:left w:val="single" w:sz="5" w:color="D9D9D9"/>
-                    <w:bottom w:val="single" w:sz="5" w:color="D9D9D9"/>
-                    <w:right w:val="single" w:sz="5" w:color="D9D9D9"/>
-                  </w:tcBorders>
-                </w:tcPr>
-                <w:p>
-                  <w:pPr>
-                    <w:spacing w:after="40" w:before="0" w:line="240" w:lineRule="auto"/>
-                  </w:pPr>
-                  <w:r>
-                    <w:rPr>
-                      <w:rFonts w:ascii="Calibri" w:hAnsi="Calibri"/>
-                      <w:sz w:val="19"/>
-                      <w:color w:val="000000"/>
-                      <w:b/>
-                    </w:rPr>
-                    <w:t xml:space="preserve">Simple-chain</w:t>
-                    <w:br/>
-                    <w:t xml:space="preserve">PPR (%)</w:t>
-                  </w:r>
-                </w:p>
-              </w:tc>
-            </w:tr>
-            <w:tr>
-              <w:trPr>
-                <w:cantSplit/>
-              </w:trPr>
-              <w:tc>
-                <w:tcPr>
-                  <w:tcW w:type="dxa" w:w="2100"/>
-                  <w:vAlign w:val="center"/>
-                  <w:shd w:fill="FFFFFF"/>
-                  <w:tcMar>
-                    <w:top w:w="90" w:type="dxa"/>
-                    <w:bottom w:w="90" w:type="dxa"/>
-                    <w:left w:w="110" w:type="dxa"/>
-                    <w:right w:w="110" w:type="dxa"/>
-                  </w:tcMar>
-                  <w:tcBorders>
-                    <w:top w:val="single" w:sz="5" w:color="D9D9D9"/>
-                    <w:left w:val="single" w:sz="5" w:color="D9D9D9"/>
-                    <w:bottom w:val="single" w:sz="5" w:color="D9D9D9"/>
-                    <w:right w:val="single" w:sz="5" w:color="D9D9D9"/>
-                  </w:tcBorders>
-                </w:tcPr>
-                <w:p>
-                  <w:pPr>
-                    <w:spacing w:after="40" w:before="0" w:line="240" w:lineRule="auto"/>
-                  </w:pPr>
-                  <w:r>
-                    <w:rPr>
-                      <w:rFonts w:ascii="Calibri" w:hAnsi="Calibri"/>
-                      <w:sz w:val="19"/>
-                      <w:color w:val="000000"/>
-                    </w:rPr>
-                    <w:t xml:space="preserve">High</w:t>
-                  </w:r>
-                </w:p>
-              </w:tc>
-              <w:tc>
-                <w:tcPr>
-                  <w:tcW w:type="dxa" w:w="1120"/>
-                  <w:vAlign w:val="center"/>
-                  <w:shd w:fill="FFFFFF"/>
-                  <w:tcMar>
-                    <w:top w:w="90" w:type="dxa"/>
-                    <w:bottom w:w="90" w:type="dxa"/>
-                    <w:left w:w="110" w:type="dxa"/>
-                    <w:right w:w="110" w:type="dxa"/>
-                  </w:tcMar>
-                  <w:tcBorders>
-                    <w:top w:val="single" w:sz="5" w:color="D9D9D9"/>
-                    <w:left w:val="single" w:sz="5" w:color="D9D9D9"/>
-                    <w:bottom w:val="single" w:sz="5" w:color="D9D9D9"/>
-                    <w:right w:val="single" w:sz="5" w:color="D9D9D9"/>
-                  </w:tcBorders>
-                </w:tcPr>
-                <w:p>
-                  <w:pPr>
-                    <w:spacing w:after="40" w:before="0" w:line="240" w:lineRule="auto"/>
-                  </w:pPr>
-                  <w:r>
-                    <w:rPr>
-                      <w:rFonts w:ascii="Calibri" w:hAnsi="Calibri"/>
-                      <w:sz w:val="19"/>
-                      <w:color w:val="000000"/>
-                    </w:rPr>
-                    <w:t xml:space="preserve">[n]</w:t>
-                  </w:r>
-                </w:p>
-              </w:tc>
-              <w:tc>
-                <w:tcPr>
-                  <w:tcW w:type="dxa" w:w="1700"/>
-                  <w:vAlign w:val="center"/>
-                  <w:shd w:fill="FFFFFF"/>
-                  <w:tcMar>
-                    <w:top w:w="90" w:type="dxa"/>
-                    <w:bottom w:w="90" w:type="dxa"/>
-                    <w:left w:w="110" w:type="dxa"/>
-                    <w:right w:w="110" w:type="dxa"/>
-                  </w:tcMar>
-                  <w:tcBorders>
-                    <w:top w:val="single" w:sz="5" w:color="D9D9D9"/>
-                    <w:left w:val="single" w:sz="5" w:color="D9D9D9"/>
-                    <w:bottom w:val="single" w:sz="5" w:color="D9D9D9"/>
-                    <w:right w:val="single" w:sz="5" w:color="D9D9D9"/>
-                  </w:tcBorders>
-                </w:tcPr>
-                <w:p>
-                  <w:pPr>
-                    <w:spacing w:after="40" w:before="0" w:line="240" w:lineRule="auto"/>
-                  </w:pPr>
-                  <w:r>
-                    <w:rPr>
-                      <w:rFonts w:ascii="Calibri" w:hAnsi="Calibri"/>
-                      <w:sz w:val="19"/>
-                      <w:color w:val="000000"/>
-                    </w:rPr>
-                    <w:t xml:space="preserve">[%]</w:t>
-                  </w:r>
-                </w:p>
-              </w:tc>
-              <w:tc>
-                <w:tcPr>
-                  <w:tcW w:type="dxa" w:w="2554"/>
-                  <w:vAlign w:val="center"/>
-                  <w:shd w:fill="FFFFFF"/>
-                  <w:tcMar>
-                    <w:top w:w="90" w:type="dxa"/>
-                    <w:bottom w:w="90" w:type="dxa"/>
-                    <w:left w:w="110" w:type="dxa"/>
-                    <w:right w:w="110" w:type="dxa"/>
-                  </w:tcMar>
-                  <w:tcBorders>
-                    <w:top w:val="single" w:sz="5" w:color="D9D9D9"/>
-                    <w:left w:val="single" w:sz="5" w:color="D9D9D9"/>
-                    <w:bottom w:val="single" w:sz="5" w:color="D9D9D9"/>
-                    <w:right w:val="single" w:sz="5" w:color="D9D9D9"/>
-                  </w:tcBorders>
-                </w:tcPr>
-                <w:p>
-                  <w:pPr>
-                    <w:spacing w:after="40" w:before="0" w:line="240" w:lineRule="auto"/>
-                  </w:pPr>
-                  <w:r>
-                    <w:rPr>
-                      <w:rFonts w:ascii="Calibri" w:hAnsi="Calibri"/>
-                      <w:sz w:val="19"/>
-                      <w:color w:val="000000"/>
-                    </w:rPr>
-                    <w:t xml:space="preserve">[%]</w:t>
-                  </w:r>
-                </w:p>
-              </w:tc>
-            </w:tr>
-            <w:tr>
-              <w:trPr>
-                <w:cantSplit/>
-              </w:trPr>
-              <w:tc>
-                <w:tcPr>
-                  <w:tcW w:type="dxa" w:w="2100"/>
-                  <w:vAlign w:val="center"/>
-                  <w:shd w:fill="FFFFFF"/>
-                  <w:tcMar>
-                    <w:top w:w="90" w:type="dxa"/>
-                    <w:bottom w:w="90" w:type="dxa"/>
-                    <w:left w:w="110" w:type="dxa"/>
-                    <w:right w:w="110" w:type="dxa"/>
-                  </w:tcMar>
-                  <w:tcBorders>
-                    <w:top w:val="single" w:sz="5" w:color="D9D9D9"/>
-                    <w:left w:val="single" w:sz="5" w:color="D9D9D9"/>
-                    <w:bottom w:val="single" w:sz="5" w:color="D9D9D9"/>
-                    <w:right w:val="single" w:sz="5" w:color="D9D9D9"/>
-                  </w:tcBorders>
-                </w:tcPr>
-                <w:p>
-                  <w:pPr>
-                    <w:spacing w:after="40" w:before="0" w:line="240" w:lineRule="auto"/>
-                  </w:pPr>
-                  <w:r>
-                    <w:rPr>
-                      <w:rFonts w:ascii="Calibri" w:hAnsi="Calibri"/>
-                      <w:sz w:val="19"/>
-                      <w:color w:val="000000"/>
-                    </w:rPr>
-                    <w:t xml:space="preserve">Medium</w:t>
-                  </w:r>
-                </w:p>
-              </w:tc>
-              <w:tc>
-                <w:tcPr>
-                  <w:tcW w:type="dxa" w:w="1120"/>
-                  <w:vAlign w:val="center"/>
-                  <w:shd w:fill="FFFFFF"/>
-                  <w:tcMar>
-                    <w:top w:w="90" w:type="dxa"/>
-                    <w:bottom w:w="90" w:type="dxa"/>
-                    <w:left w:w="110" w:type="dxa"/>
-                    <w:right w:w="110" w:type="dxa"/>
-                  </w:tcMar>
-                  <w:tcBorders>
-                    <w:top w:val="single" w:sz="5" w:color="D9D9D9"/>
-                    <w:left w:val="single" w:sz="5" w:color="D9D9D9"/>
-                    <w:bottom w:val="single" w:sz="5" w:color="D9D9D9"/>
-                    <w:right w:val="single" w:sz="5" w:color="D9D9D9"/>
-                  </w:tcBorders>
-                </w:tcPr>
-                <w:p>
-                  <w:pPr>
-                    <w:spacing w:after="40" w:before="0" w:line="240" w:lineRule="auto"/>
-                  </w:pPr>
-                  <w:r>
-                    <w:rPr>
-                      <w:rFonts w:ascii="Calibri" w:hAnsi="Calibri"/>
-                      <w:sz w:val="19"/>
-                      <w:color w:val="000000"/>
-                    </w:rPr>
-                    <w:t xml:space="preserve">[n]</w:t>
-                  </w:r>
-                </w:p>
-              </w:tc>
-              <w:tc>
-                <w:tcPr>
-                  <w:tcW w:type="dxa" w:w="1700"/>
-                  <w:vAlign w:val="center"/>
-                  <w:shd w:fill="FFFFFF"/>
-                  <w:tcMar>
-                    <w:top w:w="90" w:type="dxa"/>
-                    <w:bottom w:w="90" w:type="dxa"/>
-                    <w:left w:w="110" w:type="dxa"/>
-                    <w:right w:w="110" w:type="dxa"/>
-                  </w:tcMar>
-                  <w:tcBorders>
-                    <w:top w:val="single" w:sz="5" w:color="D9D9D9"/>
-                    <w:left w:val="single" w:sz="5" w:color="D9D9D9"/>
-                    <w:bottom w:val="single" w:sz="5" w:color="D9D9D9"/>
-                    <w:right w:val="single" w:sz="5" w:color="D9D9D9"/>
-                  </w:tcBorders>
-                </w:tcPr>
-                <w:p>
-                  <w:pPr>
-                    <w:spacing w:after="40" w:before="0" w:line="240" w:lineRule="auto"/>
-                  </w:pPr>
-                  <w:r>
-                    <w:rPr>
-                      <w:rFonts w:ascii="Calibri" w:hAnsi="Calibri"/>
-                      <w:sz w:val="19"/>
-                      <w:color w:val="000000"/>
-                    </w:rPr>
-                    <w:t xml:space="preserve">[%]</w:t>
-                  </w:r>
-                </w:p>
-              </w:tc>
-              <w:tc>
-                <w:tcPr>
-                  <w:tcW w:type="dxa" w:w="2554"/>
-                  <w:vAlign w:val="center"/>
-                  <w:shd w:fill="FFFFFF"/>
-                  <w:tcMar>
-                    <w:top w:w="90" w:type="dxa"/>
-                    <w:bottom w:w="90" w:type="dxa"/>
-                    <w:left w:w="110" w:type="dxa"/>
-                    <w:right w:w="110" w:type="dxa"/>
-                  </w:tcMar>
-                  <w:tcBorders>
-                    <w:top w:val="single" w:sz="5" w:color="D9D9D9"/>
-                    <w:left w:val="single" w:sz="5" w:color="D9D9D9"/>
-                    <w:bottom w:val="single" w:sz="5" w:color="D9D9D9"/>
-                    <w:right w:val="single" w:sz="5" w:color="D9D9D9"/>
-                  </w:tcBorders>
-                </w:tcPr>
-                <w:p>
-                  <w:pPr>
-                    <w:spacing w:after="40" w:before="0" w:line="240" w:lineRule="auto"/>
-                  </w:pPr>
-                  <w:r>
-                    <w:rPr>
-                      <w:rFonts w:ascii="Calibri" w:hAnsi="Calibri"/>
-                      <w:sz w:val="19"/>
-                      <w:color w:val="000000"/>
-                    </w:rPr>
-                    <w:t xml:space="preserve">[%]</w:t>
-                  </w:r>
-                </w:p>
-              </w:tc>
-            </w:tr>
-            <w:tr>
-              <w:trPr>
-                <w:cantSplit/>
-              </w:trPr>
-              <w:tc>
-                <w:tcPr>
-                  <w:tcW w:type="dxa" w:w="2100"/>
-                  <w:vAlign w:val="center"/>
-                  <w:shd w:fill="FFFFFF"/>
-                  <w:tcMar>
-                    <w:top w:w="90" w:type="dxa"/>
-                    <w:bottom w:w="90" w:type="dxa"/>
-                    <w:left w:w="110" w:type="dxa"/>
-                    <w:right w:w="110" w:type="dxa"/>
-                  </w:tcMar>
-                  <w:tcBorders>
-                    <w:top w:val="single" w:sz="5" w:color="D9D9D9"/>
-                    <w:left w:val="single" w:sz="5" w:color="D9D9D9"/>
-                    <w:bottom w:val="single" w:sz="5" w:color="D9D9D9"/>
-                    <w:right w:val="single" w:sz="5" w:color="D9D9D9"/>
-                  </w:tcBorders>
-                </w:tcPr>
-                <w:p>
-                  <w:pPr>
-                    <w:spacing w:after="40" w:before="0" w:line="240" w:lineRule="auto"/>
-                  </w:pPr>
-                  <w:r>
-                    <w:rPr>
-                      <w:rFonts w:ascii="Calibri" w:hAnsi="Calibri"/>
-                      <w:sz w:val="19"/>
-                      <w:color w:val="000000"/>
-                    </w:rPr>
-                    <w:t xml:space="preserve">Low</w:t>
-                  </w:r>
-                </w:p>
-              </w:tc>
-              <w:tc>
-                <w:tcPr>
-                  <w:tcW w:type="dxa" w:w="1120"/>
-                  <w:vAlign w:val="center"/>
-                  <w:shd w:fill="FFFFFF"/>
-                  <w:tcMar>
-                    <w:top w:w="90" w:type="dxa"/>
-                    <w:bottom w:w="90" w:type="dxa"/>
-                    <w:left w:w="110" w:type="dxa"/>
-                    <w:right w:w="110" w:type="dxa"/>
-                  </w:tcMar>
-                  <w:tcBorders>
-                    <w:top w:val="single" w:sz="5" w:color="D9D9D9"/>
-                    <w:left w:val="single" w:sz="5" w:color="D9D9D9"/>
-                    <w:bottom w:val="single" w:sz="5" w:color="D9D9D9"/>
-                    <w:right w:val="single" w:sz="5" w:color="D9D9D9"/>
-                  </w:tcBorders>
-                </w:tcPr>
-                <w:p>
-                  <w:pPr>
-                    <w:spacing w:after="40" w:before="0" w:line="240" w:lineRule="auto"/>
-                  </w:pPr>
-                  <w:r>
-                    <w:rPr>
-                      <w:rFonts w:ascii="Calibri" w:hAnsi="Calibri"/>
-                      <w:sz w:val="19"/>
-                      <w:color w:val="000000"/>
-                    </w:rPr>
-                    <w:t xml:space="preserve">[n]</w:t>
-                  </w:r>
-                </w:p>
-              </w:tc>
-              <w:tc>
-                <w:tcPr>
-                  <w:tcW w:type="dxa" w:w="1700"/>
-                  <w:vAlign w:val="center"/>
-                  <w:shd w:fill="FFFFFF"/>
-                  <w:tcMar>
-                    <w:top w:w="90" w:type="dxa"/>
-                    <w:bottom w:w="90" w:type="dxa"/>
-                    <w:left w:w="110" w:type="dxa"/>
-                    <w:right w:w="110" w:type="dxa"/>
-                  </w:tcMar>
-                  <w:tcBorders>
-                    <w:top w:val="single" w:sz="5" w:color="D9D9D9"/>
-                    <w:left w:val="single" w:sz="5" w:color="D9D9D9"/>
-                    <w:bottom w:val="single" w:sz="5" w:color="D9D9D9"/>
-                    <w:right w:val="single" w:sz="5" w:color="D9D9D9"/>
-                  </w:tcBorders>
-                </w:tcPr>
-                <w:p>
-                  <w:pPr>
-                    <w:spacing w:after="40" w:before="0" w:line="240" w:lineRule="auto"/>
-                  </w:pPr>
-                  <w:r>
-                    <w:rPr>
-                      <w:rFonts w:ascii="Calibri" w:hAnsi="Calibri"/>
-                      <w:sz w:val="19"/>
-                      <w:color w:val="000000"/>
-                    </w:rPr>
-                    <w:t xml:space="preserve">[%]</w:t>
-                  </w:r>
-                </w:p>
-              </w:tc>
-              <w:tc>
-                <w:tcPr>
-                  <w:tcW w:type="dxa" w:w="2554"/>
-                  <w:vAlign w:val="center"/>
-                  <w:shd w:fill="FFFFFF"/>
-                  <w:tcMar>
-                    <w:top w:w="90" w:type="dxa"/>
-                    <w:bottom w:w="90" w:type="dxa"/>
-                    <w:left w:w="110" w:type="dxa"/>
-                    <w:right w:w="110" w:type="dxa"/>
-                  </w:tcMar>
-                  <w:tcBorders>
-                    <w:top w:val="single" w:sz="5" w:color="D9D9D9"/>
-                    <w:left w:val="single" w:sz="5" w:color="D9D9D9"/>
-                    <w:bottom w:val="single" w:sz="5" w:color="D9D9D9"/>
-                    <w:right w:val="single" w:sz="5" w:color="D9D9D9"/>
-                  </w:tcBorders>
-                </w:tcPr>
-                <w:p>
-                  <w:pPr>
-                    <w:spacing w:after="40" w:before="0" w:line="240" w:lineRule="auto"/>
-                  </w:pPr>
-                  <w:r>
-                    <w:rPr>
-                      <w:rFonts w:ascii="Calibri" w:hAnsi="Calibri"/>
-                      <w:sz w:val="19"/>
-                      <w:color w:val="000000"/>
-                    </w:rPr>
-                    <w:t xml:space="preserve">[%]</w:t>
-                  </w:r>
-                </w:p>
-              </w:tc>
-            </w:tr>
-            <w:tr>
-              <w:trPr>
-                <w:cantSplit/>
-              </w:trPr>
-              <w:tc>
-                <w:tcPr>
-                  <w:tcW w:type="dxa" w:w="2100"/>
-                  <w:vAlign w:val="center"/>
-                  <w:shd w:fill="FFFFFF"/>
-                  <w:tcMar>
-                    <w:top w:w="90" w:type="dxa"/>
-                    <w:bottom w:w="90" w:type="dxa"/>
-                    <w:left w:w="110" w:type="dxa"/>
-                    <w:right w:w="110" w:type="dxa"/>
-                  </w:tcMar>
-                  <w:tcBorders>
-                    <w:top w:val="single" w:sz="5" w:color="D9D9D9"/>
-                    <w:left w:val="single" w:sz="5" w:color="D9D9D9"/>
-                    <w:bottom w:val="single" w:sz="5" w:color="D9D9D9"/>
-                    <w:right w:val="single" w:sz="5" w:color="D9D9D9"/>
-                  </w:tcBorders>
-                </w:tcPr>
-                <w:p>
-                  <w:pPr>
-                    <w:spacing w:after="40" w:before="0" w:line="240" w:lineRule="auto"/>
-                  </w:pPr>
-                  <w:r>
-                    <w:rPr>
-                      <w:rFonts w:ascii="Calibri" w:hAnsi="Calibri"/>
-                      <w:sz w:val="19"/>
-                      <w:color w:val="000000"/>
-                    </w:rPr>
-                    <w:t xml:space="preserve">Unresolved</w:t>
-                  </w:r>
-                </w:p>
-              </w:tc>
-              <w:tc>
-                <w:tcPr>
-                  <w:tcW w:type="dxa" w:w="1120"/>
-                  <w:vAlign w:val="center"/>
-                  <w:shd w:fill="FFFFFF"/>
-                  <w:tcMar>
-                    <w:top w:w="90" w:type="dxa"/>
-                    <w:bottom w:w="90" w:type="dxa"/>
-                    <w:left w:w="110" w:type="dxa"/>
-                    <w:right w:w="110" w:type="dxa"/>
-                  </w:tcMar>
-                  <w:tcBorders>
-                    <w:top w:val="single" w:sz="5" w:color="D9D9D9"/>
-                    <w:left w:val="single" w:sz="5" w:color="D9D9D9"/>
-                    <w:bottom w:val="single" w:sz="5" w:color="D9D9D9"/>
-                    <w:right w:val="single" w:sz="5" w:color="D9D9D9"/>
-                  </w:tcBorders>
-                </w:tcPr>
-                <w:p>
-                  <w:pPr>
-                    <w:spacing w:after="40" w:before="0" w:line="240" w:lineRule="auto"/>
-                  </w:pPr>
-                  <w:r>
-                    <w:rPr>
-                      <w:rFonts w:ascii="Calibri" w:hAnsi="Calibri"/>
-                      <w:sz w:val="19"/>
-                      <w:color w:val="000000"/>
-                    </w:rPr>
-                    <w:t xml:space="preserve">[n]</w:t>
-                  </w:r>
-                </w:p>
-              </w:tc>
-              <w:tc>
-                <w:tcPr>
-                  <w:tcW w:type="dxa" w:w="1700"/>
-                  <w:vAlign w:val="center"/>
-                  <w:shd w:fill="FFFFFF"/>
-                  <w:tcMar>
-                    <w:top w:w="90" w:type="dxa"/>
-                    <w:bottom w:w="90" w:type="dxa"/>
-                    <w:left w:w="110" w:type="dxa"/>
-                    <w:right w:w="110" w:type="dxa"/>
-                  </w:tcMar>
-                  <w:tcBorders>
-                    <w:top w:val="single" w:sz="5" w:color="D9D9D9"/>
-                    <w:left w:val="single" w:sz="5" w:color="D9D9D9"/>
-                    <w:bottom w:val="single" w:sz="5" w:color="D9D9D9"/>
-                    <w:right w:val="single" w:sz="5" w:color="D9D9D9"/>
-                  </w:tcBorders>
-                </w:tcPr>
-                <w:p>
-                  <w:pPr>
-                    <w:spacing w:after="40" w:before="0" w:line="240" w:lineRule="auto"/>
-                  </w:pPr>
-                  <w:r>
-                    <w:rPr>
-                      <w:rFonts w:ascii="Calibri" w:hAnsi="Calibri"/>
-                      <w:sz w:val="19"/>
-                      <w:color w:val="000000"/>
-                    </w:rPr>
-                    <w:t xml:space="preserve">[%]</w:t>
-                  </w:r>
-                </w:p>
-              </w:tc>
-              <w:tc>
-                <w:tcPr>
-                  <w:tcW w:type="dxa" w:w="2554"/>
-                  <w:vAlign w:val="center"/>
-                  <w:shd w:fill="FFFFFF"/>
-                  <w:tcMar>
-                    <w:top w:w="90" w:type="dxa"/>
-                    <w:bottom w:w="90" w:type="dxa"/>
-                    <w:left w:w="110" w:type="dxa"/>
-                    <w:right w:w="110" w:type="dxa"/>
-                  </w:tcMar>
-                  <w:tcBorders>
-                    <w:top w:val="single" w:sz="5" w:color="D9D9D9"/>
-                    <w:left w:val="single" w:sz="5" w:color="D9D9D9"/>
-                    <w:bottom w:val="single" w:sz="5" w:color="D9D9D9"/>
-                    <w:right w:val="single" w:sz="5" w:color="D9D9D9"/>
-                  </w:tcBorders>
-                </w:tcPr>
-                <w:p>
-                  <w:pPr>
-                    <w:spacing w:after="40" w:before="0" w:line="240" w:lineRule="auto"/>
-                  </w:pPr>
-                  <w:r>
-                    <w:rPr>
-                      <w:rFonts w:ascii="Calibri" w:hAnsi="Calibri"/>
-                      <w:sz w:val="19"/>
-                      <w:color w:val="000000"/>
-                    </w:rPr>
-                    <w:t xml:space="preserve">[%]</w:t>
-                  </w:r>
-                </w:p>
-              </w:tc>
-            </w:tr>
-          </w:tbl>
-          <w:p>
-            <w:pPr>
-              <w:spacing w:after="40" w:before="0" w:line="240" w:lineRule="auto"/>
-            </w:pPr>
-            <w:r>
-              <w:rPr>
-                <w:rFonts w:ascii="Calibri" w:hAnsi="Calibri"/>
-                <w:sz w:val="20"/>
-                <w:color w:val="000000"/>
-              </w:rPr>
-              <w:t xml:space="preserve">Membership evidence: [sources; Appendix A / full report].</w:t>
-            </w:r>
-          </w:p>
-          <w:p>
-            <w:pPr>
-              <w:spacing w:after="40" w:before="0" w:line="240" w:lineRule="auto"/>
-            </w:pPr>
-            <w:r>
-              <w:rPr>
-                <w:rFonts w:ascii="Calibri" w:hAnsi="Calibri"/>
-                <w:sz w:val="20"/>
-                <w:color w:val="000000"/>
-              </w:rPr>
-              <w:t xml:space="preserve">Weights and assumptions: [rules; sources; affected confidence].</w:t>
-            </w:r>
-          </w:p>
-          <w:p>
-            <w:pPr>
-              <w:spacing w:after="40" w:before="0" w:line="240" w:lineRule="auto"/>
-            </w:pPr>
-            <w:r>
-              <w:rPr>
-                <w:rFonts w:ascii="Calibri" w:hAnsi="Calibri"/>
-                <w:sz w:val="20"/>
-                <w:color w:val="000000"/>
-              </w:rPr>
-              <w:t xml:space="preserve">[If needed: PPR unavailable for n taxa, x% of catch; shares use known PPR.]</w:t>
-            </w:r>
-          </w:p>
-        </w:tc>
-      </w:tr>
-      <w:tr>
-        <w:trPr>
-          <w:cantSplit/>
-        </w:trPr>
-        <w:tc>
-          <w:tcPr>
-            <w:tcW w:type="dxa" w:w="2203"/>
-            <w:vAlign w:val="center"/>
-            <w:shd w:fill="FFFFFF"/>
-            <w:tcMar>
-              <w:top w:w="90" w:type="dxa"/>
-              <w:bottom w:w="90" w:type="dxa"/>
-              <w:left w:w="110" w:type="dxa"/>
-              <w:right w:w="110" w:type="dxa"/>
-            </w:tcMar>
-            <w:tcBorders>
-              <w:top w:val="single" w:sz="5" w:color="D9D9D9"/>
-              <w:left w:val="single" w:sz="5" w:color="D9D9D9"/>
-              <w:bottom w:val="single" w:sz="5" w:color="D9D9D9"/>
-              <w:right w:val="single" w:sz="5" w:color="D9D9D9"/>
-            </w:tcBorders>
-          </w:tcPr>
-          <w:p>
-            <w:pPr>
               <w:spacing w:after="40"/>
             </w:pPr>
             <w:r>
@@ -2269,9 +1448,1636 @@
     </w:tbl>
     <w:p>
       <w:pPr>
+        <w:keepNext/>
+        <w:pageBreakBefore/>
+        <w:spacing w:after="120"/>
+      </w:pPr>
+      <w:r>
+        <w:rPr>
+          <w:rFonts w:ascii="Calibri" w:hAnsi="Calibri"/>
+          <w:b/>
+          <w:color w:val="000000"/>
+          <w:sz w:val="30"/>
+        </w:rPr>
+        <w:t>Taxon mapping and coverage</w:t>
+      </w:r>
+    </w:p>
+    <w:p>
+      <w:pPr>
+        <w:keepNext w:val="0"/>
+        <w:pageBreakBefore w:val="0"/>
+        <w:spacing w:after="120"/>
+      </w:pPr>
+      <w:r>
+        <w:rPr>
+          <w:rFonts w:ascii="Calibri" w:hAnsi="Calibri"/>
+          <w:b w:val="0"/>
+          <w:color w:val="000000"/>
+          <w:sz w:val="21"/>
+        </w:rPr>
+        <w:t>Reference: [year and catch basis]; [scope, unidentified treatment and group/taxon filters].</w:t>
+      </w:r>
+    </w:p>
+    <w:p>
+      <w:pPr>
+        <w:keepNext w:val="0"/>
+        <w:pageBreakBefore w:val="0"/>
+        <w:spacing w:after="120"/>
+      </w:pPr>
+      <w:r>
+        <w:rPr>
+          <w:rFonts w:ascii="Calibri" w:hAnsi="Calibri"/>
+          <w:b w:val="0"/>
+          <w:color w:val="000000"/>
+          <w:sz w:val="21"/>
+        </w:rPr>
+        <w:t>[n] source groups [+ synthetic imports separately]; [n] catch taxa; catch [t]; known simple-chain PPR [t C]. [Missing coefficients and affected catch share, if any.]</w:t>
+      </w:r>
+    </w:p>
+    <w:p>
+      <w:pPr>
+        <w:keepNext w:val="0"/>
+        <w:pageBreakBefore w:val="0"/>
+        <w:spacing w:after="120"/>
+      </w:pPr>
+      <w:r>
+        <w:rPr>
+          <w:rFonts w:ascii="Calibri" w:hAnsi="Calibri"/>
+          <w:b w:val="0"/>
+          <w:color w:val="000000"/>
+          <w:sz w:val="21"/>
+        </w:rPr>
+      </w:r>
+      <w:hyperlink r:id="rIdValidation1">
+        <w:r>
+          <w:rPr>
+            <w:color w:val="175E72"/>
+            <w:u w:val="single"/>
+          </w:rPr>
+          <w:t>[Linked Excel taxon appendix and descriptive Sources sheet]</w:t>
+        </w:r>
+      </w:hyperlink>
+    </w:p>
+    <w:tbl>
+      <w:tblPr>
+        <w:tblW w:type="auto" w:w="0"/>
+        <w:tblLayout w:type="fixed"/>
+        <w:tblLook w:firstColumn="1" w:firstRow="1" w:lastColumn="0" w:lastRow="0" w:noHBand="0" w:noVBand="1" w:val="04A0"/>
+      </w:tblPr>
+      <w:tblGrid>
+        <w:gridCol w:w="3888"/>
+        <w:gridCol w:w="1440"/>
+        <w:gridCol w:w="2304"/>
+        <w:gridCol w:w="2376"/>
+      </w:tblGrid>
+      <w:tr>
+        <w:trPr>
+          <w:tblHeader/>
+          <w:cantSplit/>
+        </w:trPr>
+        <w:tc>
+          <w:tcPr>
+            <w:tcW w:type="dxa" w:w="3888"/>
+            <w:shd w:fill="DDE9EE"/>
+            <w:tcBorders>
+              <w:top w:val="single" w:sz="4" w:color="D9D9D9"/>
+              <w:left w:val="single" w:sz="4" w:color="D9D9D9"/>
+              <w:bottom w:val="single" w:sz="4" w:color="D9D9D9"/>
+              <w:right w:val="single" w:sz="4" w:color="D9D9D9"/>
+            </w:tcBorders>
+            <w:tcMar>
+              <w:top w:w="75" w:type="dxa"/>
+              <w:left w:w="75" w:type="dxa"/>
+              <w:bottom w:w="75" w:type="dxa"/>
+              <w:right w:w="75" w:type="dxa"/>
+            </w:tcMar>
+          </w:tcPr>
+          <w:p>
+            <w:pPr>
+              <w:spacing w:after="40" w:before="40"/>
+            </w:pPr>
+            <w:r>
+              <w:rPr>
+                <w:rFonts w:ascii="Calibri" w:hAnsi="Calibri"/>
+                <w:b/>
+                <w:color w:val="000000"/>
+                <w:sz w:val="20"/>
+              </w:rPr>
+              <w:t>Overall confidence</w:t>
+            </w:r>
+          </w:p>
+        </w:tc>
+        <w:tc>
+          <w:tcPr>
+            <w:tcW w:type="dxa" w:w="1440"/>
+            <w:shd w:fill="DDE9EE"/>
+            <w:tcBorders>
+              <w:top w:val="single" w:sz="4" w:color="D9D9D9"/>
+              <w:left w:val="single" w:sz="4" w:color="D9D9D9"/>
+              <w:bottom w:val="single" w:sz="4" w:color="D9D9D9"/>
+              <w:right w:val="single" w:sz="4" w:color="D9D9D9"/>
+            </w:tcBorders>
+            <w:tcMar>
+              <w:top w:w="75" w:type="dxa"/>
+              <w:left w:w="75" w:type="dxa"/>
+              <w:bottom w:w="75" w:type="dxa"/>
+              <w:right w:w="75" w:type="dxa"/>
+            </w:tcMar>
+          </w:tcPr>
+          <w:p>
+            <w:pPr>
+              <w:spacing w:after="40" w:before="40"/>
+              <w:jc w:val="center"/>
+            </w:pPr>
+            <w:r>
+              <w:rPr>
+                <w:rFonts w:ascii="Calibri" w:hAnsi="Calibri"/>
+                <w:b/>
+                <w:color w:val="000000"/>
+                <w:sz w:val="20"/>
+              </w:rPr>
+              <w:t>Taxa</w:t>
+            </w:r>
+          </w:p>
+        </w:tc>
+        <w:tc>
+          <w:tcPr>
+            <w:tcW w:type="dxa" w:w="2304"/>
+            <w:shd w:fill="DDE9EE"/>
+            <w:tcBorders>
+              <w:top w:val="single" w:sz="4" w:color="D9D9D9"/>
+              <w:left w:val="single" w:sz="4" w:color="D9D9D9"/>
+              <w:bottom w:val="single" w:sz="4" w:color="D9D9D9"/>
+              <w:right w:val="single" w:sz="4" w:color="D9D9D9"/>
+            </w:tcBorders>
+            <w:tcMar>
+              <w:top w:w="75" w:type="dxa"/>
+              <w:left w:w="75" w:type="dxa"/>
+              <w:bottom w:w="75" w:type="dxa"/>
+              <w:right w:w="75" w:type="dxa"/>
+            </w:tcMar>
+          </w:tcPr>
+          <w:p>
+            <w:pPr>
+              <w:spacing w:after="40" w:before="40"/>
+              <w:jc w:val="center"/>
+            </w:pPr>
+            <w:r>
+              <w:rPr>
+                <w:rFonts w:ascii="Calibri" w:hAnsi="Calibri"/>
+                <w:b/>
+                <w:color w:val="000000"/>
+                <w:sz w:val="20"/>
+              </w:rPr>
+              <w:t>Catch percentage</w:t>
+            </w:r>
+          </w:p>
+        </w:tc>
+        <w:tc>
+          <w:tcPr>
+            <w:tcW w:type="dxa" w:w="2376"/>
+            <w:shd w:fill="DDE9EE"/>
+            <w:tcBorders>
+              <w:top w:val="single" w:sz="4" w:color="D9D9D9"/>
+              <w:left w:val="single" w:sz="4" w:color="D9D9D9"/>
+              <w:bottom w:val="single" w:sz="4" w:color="D9D9D9"/>
+              <w:right w:val="single" w:sz="4" w:color="D9D9D9"/>
+            </w:tcBorders>
+            <w:tcMar>
+              <w:top w:w="75" w:type="dxa"/>
+              <w:left w:w="75" w:type="dxa"/>
+              <w:bottom w:w="75" w:type="dxa"/>
+              <w:right w:w="75" w:type="dxa"/>
+            </w:tcMar>
+          </w:tcPr>
+          <w:p>
+            <w:pPr>
+              <w:spacing w:after="40" w:before="40"/>
+              <w:jc w:val="center"/>
+            </w:pPr>
+            <w:r>
+              <w:rPr>
+                <w:rFonts w:ascii="Calibri" w:hAnsi="Calibri"/>
+                <w:b/>
+                <w:color w:val="000000"/>
+                <w:sz w:val="20"/>
+              </w:rPr>
+              <w:t>PPR percentage</w:t>
+            </w:r>
+          </w:p>
+        </w:tc>
+      </w:tr>
+      <w:tr>
+        <w:trPr>
+          <w:cantSplit/>
+        </w:trPr>
+        <w:tc>
+          <w:tcPr>
+            <w:tcW w:type="dxa" w:w="3888"/>
+            <w:shd w:fill="FFFFFF"/>
+            <w:tcBorders>
+              <w:top w:val="single" w:sz="4" w:color="D9D9D9"/>
+              <w:left w:val="single" w:sz="4" w:color="D9D9D9"/>
+              <w:bottom w:val="single" w:sz="4" w:color="D9D9D9"/>
+              <w:right w:val="single" w:sz="4" w:color="D9D9D9"/>
+            </w:tcBorders>
+            <w:tcMar>
+              <w:top w:w="75" w:type="dxa"/>
+              <w:left w:w="75" w:type="dxa"/>
+              <w:bottom w:w="75" w:type="dxa"/>
+              <w:right w:w="75" w:type="dxa"/>
+            </w:tcMar>
+          </w:tcPr>
+          <w:p>
+            <w:pPr>
+              <w:spacing w:after="40" w:before="40"/>
+            </w:pPr>
+            <w:r>
+              <w:rPr>
+                <w:rFonts w:ascii="Calibri" w:hAnsi="Calibri"/>
+                <w:b w:val="0"/>
+                <w:color w:val="000000"/>
+                <w:sz w:val="20"/>
+              </w:rPr>
+              <w:t>High</w:t>
+            </w:r>
+          </w:p>
+        </w:tc>
+        <w:tc>
+          <w:tcPr>
+            <w:tcW w:type="dxa" w:w="1440"/>
+            <w:shd w:fill="FFFFFF"/>
+            <w:tcBorders>
+              <w:top w:val="single" w:sz="4" w:color="D9D9D9"/>
+              <w:left w:val="single" w:sz="4" w:color="D9D9D9"/>
+              <w:bottom w:val="single" w:sz="4" w:color="D9D9D9"/>
+              <w:right w:val="single" w:sz="4" w:color="D9D9D9"/>
+            </w:tcBorders>
+            <w:tcMar>
+              <w:top w:w="75" w:type="dxa"/>
+              <w:left w:w="75" w:type="dxa"/>
+              <w:bottom w:w="75" w:type="dxa"/>
+              <w:right w:w="75" w:type="dxa"/>
+            </w:tcMar>
+          </w:tcPr>
+          <w:p>
+            <w:pPr>
+              <w:spacing w:after="40" w:before="40"/>
+              <w:jc w:val="center"/>
+            </w:pPr>
+            <w:r>
+              <w:rPr>
+                <w:rFonts w:ascii="Calibri" w:hAnsi="Calibri"/>
+                <w:b w:val="0"/>
+                <w:color w:val="000000"/>
+                <w:sz w:val="20"/>
+              </w:rPr>
+              <w:t>[n]</w:t>
+            </w:r>
+          </w:p>
+        </w:tc>
+        <w:tc>
+          <w:tcPr>
+            <w:tcW w:type="dxa" w:w="2304"/>
+            <w:shd w:fill="FFFFFF"/>
+            <w:tcBorders>
+              <w:top w:val="single" w:sz="4" w:color="D9D9D9"/>
+              <w:left w:val="single" w:sz="4" w:color="D9D9D9"/>
+              <w:bottom w:val="single" w:sz="4" w:color="D9D9D9"/>
+              <w:right w:val="single" w:sz="4" w:color="D9D9D9"/>
+            </w:tcBorders>
+            <w:tcMar>
+              <w:top w:w="75" w:type="dxa"/>
+              <w:left w:w="75" w:type="dxa"/>
+              <w:bottom w:w="75" w:type="dxa"/>
+              <w:right w:w="75" w:type="dxa"/>
+            </w:tcMar>
+          </w:tcPr>
+          <w:p>
+            <w:pPr>
+              <w:spacing w:after="40" w:before="40"/>
+              <w:jc w:val="center"/>
+            </w:pPr>
+            <w:r>
+              <w:rPr>
+                <w:rFonts w:ascii="Calibri" w:hAnsi="Calibri"/>
+                <w:b w:val="0"/>
+                <w:color w:val="000000"/>
+                <w:sz w:val="20"/>
+              </w:rPr>
+              <w:t>[%]</w:t>
+            </w:r>
+          </w:p>
+        </w:tc>
+        <w:tc>
+          <w:tcPr>
+            <w:tcW w:type="dxa" w:w="2376"/>
+            <w:shd w:fill="FFFFFF"/>
+            <w:tcBorders>
+              <w:top w:val="single" w:sz="4" w:color="D9D9D9"/>
+              <w:left w:val="single" w:sz="4" w:color="D9D9D9"/>
+              <w:bottom w:val="single" w:sz="4" w:color="D9D9D9"/>
+              <w:right w:val="single" w:sz="4" w:color="D9D9D9"/>
+            </w:tcBorders>
+            <w:tcMar>
+              <w:top w:w="75" w:type="dxa"/>
+              <w:left w:w="75" w:type="dxa"/>
+              <w:bottom w:w="75" w:type="dxa"/>
+              <w:right w:w="75" w:type="dxa"/>
+            </w:tcMar>
+          </w:tcPr>
+          <w:p>
+            <w:pPr>
+              <w:spacing w:after="40" w:before="40"/>
+              <w:jc w:val="center"/>
+            </w:pPr>
+            <w:r>
+              <w:rPr>
+                <w:rFonts w:ascii="Calibri" w:hAnsi="Calibri"/>
+                <w:b w:val="0"/>
+                <w:color w:val="000000"/>
+                <w:sz w:val="20"/>
+              </w:rPr>
+              <w:t>[%]</w:t>
+            </w:r>
+          </w:p>
+        </w:tc>
+      </w:tr>
+      <w:tr>
+        <w:trPr>
+          <w:cantSplit/>
+        </w:trPr>
+        <w:tc>
+          <w:tcPr>
+            <w:tcW w:type="dxa" w:w="3888"/>
+            <w:shd w:fill="F5F7F8"/>
+            <w:tcBorders>
+              <w:top w:val="single" w:sz="4" w:color="D9D9D9"/>
+              <w:left w:val="single" w:sz="4" w:color="D9D9D9"/>
+              <w:bottom w:val="single" w:sz="4" w:color="D9D9D9"/>
+              <w:right w:val="single" w:sz="4" w:color="D9D9D9"/>
+            </w:tcBorders>
+            <w:tcMar>
+              <w:top w:w="75" w:type="dxa"/>
+              <w:left w:w="75" w:type="dxa"/>
+              <w:bottom w:w="75" w:type="dxa"/>
+              <w:right w:w="75" w:type="dxa"/>
+            </w:tcMar>
+          </w:tcPr>
+          <w:p>
+            <w:pPr>
+              <w:spacing w:after="40" w:before="40"/>
+            </w:pPr>
+            <w:r>
+              <w:rPr>
+                <w:rFonts w:ascii="Calibri" w:hAnsi="Calibri"/>
+                <w:b w:val="0"/>
+                <w:color w:val="000000"/>
+                <w:sz w:val="20"/>
+              </w:rPr>
+              <w:t>Medium</w:t>
+            </w:r>
+          </w:p>
+        </w:tc>
+        <w:tc>
+          <w:tcPr>
+            <w:tcW w:type="dxa" w:w="1440"/>
+            <w:shd w:fill="F5F7F8"/>
+            <w:tcBorders>
+              <w:top w:val="single" w:sz="4" w:color="D9D9D9"/>
+              <w:left w:val="single" w:sz="4" w:color="D9D9D9"/>
+              <w:bottom w:val="single" w:sz="4" w:color="D9D9D9"/>
+              <w:right w:val="single" w:sz="4" w:color="D9D9D9"/>
+            </w:tcBorders>
+            <w:tcMar>
+              <w:top w:w="75" w:type="dxa"/>
+              <w:left w:w="75" w:type="dxa"/>
+              <w:bottom w:w="75" w:type="dxa"/>
+              <w:right w:w="75" w:type="dxa"/>
+            </w:tcMar>
+          </w:tcPr>
+          <w:p>
+            <w:pPr>
+              <w:spacing w:after="40" w:before="40"/>
+              <w:jc w:val="center"/>
+            </w:pPr>
+            <w:r>
+              <w:rPr>
+                <w:rFonts w:ascii="Calibri" w:hAnsi="Calibri"/>
+                <w:b w:val="0"/>
+                <w:color w:val="000000"/>
+                <w:sz w:val="20"/>
+              </w:rPr>
+              <w:t>[n]</w:t>
+            </w:r>
+          </w:p>
+        </w:tc>
+        <w:tc>
+          <w:tcPr>
+            <w:tcW w:type="dxa" w:w="2304"/>
+            <w:shd w:fill="F5F7F8"/>
+            <w:tcBorders>
+              <w:top w:val="single" w:sz="4" w:color="D9D9D9"/>
+              <w:left w:val="single" w:sz="4" w:color="D9D9D9"/>
+              <w:bottom w:val="single" w:sz="4" w:color="D9D9D9"/>
+              <w:right w:val="single" w:sz="4" w:color="D9D9D9"/>
+            </w:tcBorders>
+            <w:tcMar>
+              <w:top w:w="75" w:type="dxa"/>
+              <w:left w:w="75" w:type="dxa"/>
+              <w:bottom w:w="75" w:type="dxa"/>
+              <w:right w:w="75" w:type="dxa"/>
+            </w:tcMar>
+          </w:tcPr>
+          <w:p>
+            <w:pPr>
+              <w:spacing w:after="40" w:before="40"/>
+              <w:jc w:val="center"/>
+            </w:pPr>
+            <w:r>
+              <w:rPr>
+                <w:rFonts w:ascii="Calibri" w:hAnsi="Calibri"/>
+                <w:b w:val="0"/>
+                <w:color w:val="000000"/>
+                <w:sz w:val="20"/>
+              </w:rPr>
+              <w:t>[%]</w:t>
+            </w:r>
+          </w:p>
+        </w:tc>
+        <w:tc>
+          <w:tcPr>
+            <w:tcW w:type="dxa" w:w="2376"/>
+            <w:shd w:fill="F5F7F8"/>
+            <w:tcBorders>
+              <w:top w:val="single" w:sz="4" w:color="D9D9D9"/>
+              <w:left w:val="single" w:sz="4" w:color="D9D9D9"/>
+              <w:bottom w:val="single" w:sz="4" w:color="D9D9D9"/>
+              <w:right w:val="single" w:sz="4" w:color="D9D9D9"/>
+            </w:tcBorders>
+            <w:tcMar>
+              <w:top w:w="75" w:type="dxa"/>
+              <w:left w:w="75" w:type="dxa"/>
+              <w:bottom w:w="75" w:type="dxa"/>
+              <w:right w:w="75" w:type="dxa"/>
+            </w:tcMar>
+          </w:tcPr>
+          <w:p>
+            <w:pPr>
+              <w:spacing w:after="40" w:before="40"/>
+              <w:jc w:val="center"/>
+            </w:pPr>
+            <w:r>
+              <w:rPr>
+                <w:rFonts w:ascii="Calibri" w:hAnsi="Calibri"/>
+                <w:b w:val="0"/>
+                <w:color w:val="000000"/>
+                <w:sz w:val="20"/>
+              </w:rPr>
+              <w:t>[%]</w:t>
+            </w:r>
+          </w:p>
+        </w:tc>
+      </w:tr>
+      <w:tr>
+        <w:trPr>
+          <w:cantSplit/>
+        </w:trPr>
+        <w:tc>
+          <w:tcPr>
+            <w:tcW w:type="dxa" w:w="3888"/>
+            <w:shd w:fill="FFFFFF"/>
+            <w:tcBorders>
+              <w:top w:val="single" w:sz="4" w:color="D9D9D9"/>
+              <w:left w:val="single" w:sz="4" w:color="D9D9D9"/>
+              <w:bottom w:val="single" w:sz="4" w:color="D9D9D9"/>
+              <w:right w:val="single" w:sz="4" w:color="D9D9D9"/>
+            </w:tcBorders>
+            <w:tcMar>
+              <w:top w:w="75" w:type="dxa"/>
+              <w:left w:w="75" w:type="dxa"/>
+              <w:bottom w:w="75" w:type="dxa"/>
+              <w:right w:w="75" w:type="dxa"/>
+            </w:tcMar>
+          </w:tcPr>
+          <w:p>
+            <w:pPr>
+              <w:spacing w:after="40" w:before="40"/>
+            </w:pPr>
+            <w:r>
+              <w:rPr>
+                <w:rFonts w:ascii="Calibri" w:hAnsi="Calibri"/>
+                <w:b w:val="0"/>
+                <w:color w:val="000000"/>
+                <w:sz w:val="20"/>
+              </w:rPr>
+              <w:t>Low</w:t>
+            </w:r>
+          </w:p>
+        </w:tc>
+        <w:tc>
+          <w:tcPr>
+            <w:tcW w:type="dxa" w:w="1440"/>
+            <w:shd w:fill="FFFFFF"/>
+            <w:tcBorders>
+              <w:top w:val="single" w:sz="4" w:color="D9D9D9"/>
+              <w:left w:val="single" w:sz="4" w:color="D9D9D9"/>
+              <w:bottom w:val="single" w:sz="4" w:color="D9D9D9"/>
+              <w:right w:val="single" w:sz="4" w:color="D9D9D9"/>
+            </w:tcBorders>
+            <w:tcMar>
+              <w:top w:w="75" w:type="dxa"/>
+              <w:left w:w="75" w:type="dxa"/>
+              <w:bottom w:w="75" w:type="dxa"/>
+              <w:right w:w="75" w:type="dxa"/>
+            </w:tcMar>
+          </w:tcPr>
+          <w:p>
+            <w:pPr>
+              <w:spacing w:after="40" w:before="40"/>
+              <w:jc w:val="center"/>
+            </w:pPr>
+            <w:r>
+              <w:rPr>
+                <w:rFonts w:ascii="Calibri" w:hAnsi="Calibri"/>
+                <w:b w:val="0"/>
+                <w:color w:val="000000"/>
+                <w:sz w:val="20"/>
+              </w:rPr>
+              <w:t>[n]</w:t>
+            </w:r>
+          </w:p>
+        </w:tc>
+        <w:tc>
+          <w:tcPr>
+            <w:tcW w:type="dxa" w:w="2304"/>
+            <w:shd w:fill="FFFFFF"/>
+            <w:tcBorders>
+              <w:top w:val="single" w:sz="4" w:color="D9D9D9"/>
+              <w:left w:val="single" w:sz="4" w:color="D9D9D9"/>
+              <w:bottom w:val="single" w:sz="4" w:color="D9D9D9"/>
+              <w:right w:val="single" w:sz="4" w:color="D9D9D9"/>
+            </w:tcBorders>
+            <w:tcMar>
+              <w:top w:w="75" w:type="dxa"/>
+              <w:left w:w="75" w:type="dxa"/>
+              <w:bottom w:w="75" w:type="dxa"/>
+              <w:right w:w="75" w:type="dxa"/>
+            </w:tcMar>
+          </w:tcPr>
+          <w:p>
+            <w:pPr>
+              <w:spacing w:after="40" w:before="40"/>
+              <w:jc w:val="center"/>
+            </w:pPr>
+            <w:r>
+              <w:rPr>
+                <w:rFonts w:ascii="Calibri" w:hAnsi="Calibri"/>
+                <w:b w:val="0"/>
+                <w:color w:val="000000"/>
+                <w:sz w:val="20"/>
+              </w:rPr>
+              <w:t>[%]</w:t>
+            </w:r>
+          </w:p>
+        </w:tc>
+        <w:tc>
+          <w:tcPr>
+            <w:tcW w:type="dxa" w:w="2376"/>
+            <w:shd w:fill="FFFFFF"/>
+            <w:tcBorders>
+              <w:top w:val="single" w:sz="4" w:color="D9D9D9"/>
+              <w:left w:val="single" w:sz="4" w:color="D9D9D9"/>
+              <w:bottom w:val="single" w:sz="4" w:color="D9D9D9"/>
+              <w:right w:val="single" w:sz="4" w:color="D9D9D9"/>
+            </w:tcBorders>
+            <w:tcMar>
+              <w:top w:w="75" w:type="dxa"/>
+              <w:left w:w="75" w:type="dxa"/>
+              <w:bottom w:w="75" w:type="dxa"/>
+              <w:right w:w="75" w:type="dxa"/>
+            </w:tcMar>
+          </w:tcPr>
+          <w:p>
+            <w:pPr>
+              <w:spacing w:after="40" w:before="40"/>
+              <w:jc w:val="center"/>
+            </w:pPr>
+            <w:r>
+              <w:rPr>
+                <w:rFonts w:ascii="Calibri" w:hAnsi="Calibri"/>
+                <w:b w:val="0"/>
+                <w:color w:val="000000"/>
+                <w:sz w:val="20"/>
+              </w:rPr>
+              <w:t>[%]</w:t>
+            </w:r>
+          </w:p>
+        </w:tc>
+      </w:tr>
+      <w:tr>
+        <w:trPr>
+          <w:cantSplit/>
+        </w:trPr>
+        <w:tc>
+          <w:tcPr>
+            <w:tcW w:type="dxa" w:w="3888"/>
+            <w:shd w:fill="F5F7F8"/>
+            <w:tcBorders>
+              <w:top w:val="single" w:sz="4" w:color="D9D9D9"/>
+              <w:left w:val="single" w:sz="4" w:color="D9D9D9"/>
+              <w:bottom w:val="single" w:sz="4" w:color="D9D9D9"/>
+              <w:right w:val="single" w:sz="4" w:color="D9D9D9"/>
+            </w:tcBorders>
+            <w:tcMar>
+              <w:top w:w="75" w:type="dxa"/>
+              <w:left w:w="75" w:type="dxa"/>
+              <w:bottom w:w="75" w:type="dxa"/>
+              <w:right w:w="75" w:type="dxa"/>
+            </w:tcMar>
+          </w:tcPr>
+          <w:p>
+            <w:pPr>
+              <w:spacing w:after="40" w:before="40"/>
+            </w:pPr>
+            <w:r>
+              <w:rPr>
+                <w:rFonts w:ascii="Calibri" w:hAnsi="Calibri"/>
+                <w:b w:val="0"/>
+                <w:color w:val="000000"/>
+                <w:sz w:val="20"/>
+              </w:rPr>
+              <w:t>Very low</w:t>
+            </w:r>
+          </w:p>
+        </w:tc>
+        <w:tc>
+          <w:tcPr>
+            <w:tcW w:type="dxa" w:w="1440"/>
+            <w:shd w:fill="F5F7F8"/>
+            <w:tcBorders>
+              <w:top w:val="single" w:sz="4" w:color="D9D9D9"/>
+              <w:left w:val="single" w:sz="4" w:color="D9D9D9"/>
+              <w:bottom w:val="single" w:sz="4" w:color="D9D9D9"/>
+              <w:right w:val="single" w:sz="4" w:color="D9D9D9"/>
+            </w:tcBorders>
+            <w:tcMar>
+              <w:top w:w="75" w:type="dxa"/>
+              <w:left w:w="75" w:type="dxa"/>
+              <w:bottom w:w="75" w:type="dxa"/>
+              <w:right w:w="75" w:type="dxa"/>
+            </w:tcMar>
+          </w:tcPr>
+          <w:p>
+            <w:pPr>
+              <w:spacing w:after="40" w:before="40"/>
+              <w:jc w:val="center"/>
+            </w:pPr>
+            <w:r>
+              <w:rPr>
+                <w:rFonts w:ascii="Calibri" w:hAnsi="Calibri"/>
+                <w:b w:val="0"/>
+                <w:color w:val="000000"/>
+                <w:sz w:val="20"/>
+              </w:rPr>
+              <w:t>[n]</w:t>
+            </w:r>
+          </w:p>
+        </w:tc>
+        <w:tc>
+          <w:tcPr>
+            <w:tcW w:type="dxa" w:w="2304"/>
+            <w:shd w:fill="F5F7F8"/>
+            <w:tcBorders>
+              <w:top w:val="single" w:sz="4" w:color="D9D9D9"/>
+              <w:left w:val="single" w:sz="4" w:color="D9D9D9"/>
+              <w:bottom w:val="single" w:sz="4" w:color="D9D9D9"/>
+              <w:right w:val="single" w:sz="4" w:color="D9D9D9"/>
+            </w:tcBorders>
+            <w:tcMar>
+              <w:top w:w="75" w:type="dxa"/>
+              <w:left w:w="75" w:type="dxa"/>
+              <w:bottom w:w="75" w:type="dxa"/>
+              <w:right w:w="75" w:type="dxa"/>
+            </w:tcMar>
+          </w:tcPr>
+          <w:p>
+            <w:pPr>
+              <w:spacing w:after="40" w:before="40"/>
+              <w:jc w:val="center"/>
+            </w:pPr>
+            <w:r>
+              <w:rPr>
+                <w:rFonts w:ascii="Calibri" w:hAnsi="Calibri"/>
+                <w:b w:val="0"/>
+                <w:color w:val="000000"/>
+                <w:sz w:val="20"/>
+              </w:rPr>
+              <w:t>[%]</w:t>
+            </w:r>
+          </w:p>
+        </w:tc>
+        <w:tc>
+          <w:tcPr>
+            <w:tcW w:type="dxa" w:w="2376"/>
+            <w:shd w:fill="F5F7F8"/>
+            <w:tcBorders>
+              <w:top w:val="single" w:sz="4" w:color="D9D9D9"/>
+              <w:left w:val="single" w:sz="4" w:color="D9D9D9"/>
+              <w:bottom w:val="single" w:sz="4" w:color="D9D9D9"/>
+              <w:right w:val="single" w:sz="4" w:color="D9D9D9"/>
+            </w:tcBorders>
+            <w:tcMar>
+              <w:top w:w="75" w:type="dxa"/>
+              <w:left w:w="75" w:type="dxa"/>
+              <w:bottom w:w="75" w:type="dxa"/>
+              <w:right w:w="75" w:type="dxa"/>
+            </w:tcMar>
+          </w:tcPr>
+          <w:p>
+            <w:pPr>
+              <w:spacing w:after="40" w:before="40"/>
+              <w:jc w:val="center"/>
+            </w:pPr>
+            <w:r>
+              <w:rPr>
+                <w:rFonts w:ascii="Calibri" w:hAnsi="Calibri"/>
+                <w:b w:val="0"/>
+                <w:color w:val="000000"/>
+                <w:sz w:val="20"/>
+              </w:rPr>
+              <w:t>[%]</w:t>
+            </w:r>
+          </w:p>
+        </w:tc>
+      </w:tr>
+      <w:tr>
+        <w:trPr>
+          <w:cantSplit/>
+        </w:trPr>
+        <w:tc>
+          <w:tcPr>
+            <w:tcW w:type="dxa" w:w="3888"/>
+            <w:shd w:fill="FFFFFF"/>
+            <w:tcBorders>
+              <w:top w:val="single" w:sz="4" w:color="D9D9D9"/>
+              <w:left w:val="single" w:sz="4" w:color="D9D9D9"/>
+              <w:bottom w:val="single" w:sz="4" w:color="D9D9D9"/>
+              <w:right w:val="single" w:sz="4" w:color="D9D9D9"/>
+            </w:tcBorders>
+            <w:tcMar>
+              <w:top w:w="75" w:type="dxa"/>
+              <w:left w:w="75" w:type="dxa"/>
+              <w:bottom w:w="75" w:type="dxa"/>
+              <w:right w:w="75" w:type="dxa"/>
+            </w:tcMar>
+          </w:tcPr>
+          <w:p>
+            <w:pPr>
+              <w:spacing w:after="40" w:before="40"/>
+            </w:pPr>
+            <w:r>
+              <w:rPr>
+                <w:rFonts w:ascii="Calibri" w:hAnsi="Calibri"/>
+                <w:b w:val="0"/>
+                <w:color w:val="000000"/>
+                <w:sz w:val="20"/>
+              </w:rPr>
+              <w:t>Unresolved</w:t>
+            </w:r>
+          </w:p>
+        </w:tc>
+        <w:tc>
+          <w:tcPr>
+            <w:tcW w:type="dxa" w:w="1440"/>
+            <w:shd w:fill="FFFFFF"/>
+            <w:tcBorders>
+              <w:top w:val="single" w:sz="4" w:color="D9D9D9"/>
+              <w:left w:val="single" w:sz="4" w:color="D9D9D9"/>
+              <w:bottom w:val="single" w:sz="4" w:color="D9D9D9"/>
+              <w:right w:val="single" w:sz="4" w:color="D9D9D9"/>
+            </w:tcBorders>
+            <w:tcMar>
+              <w:top w:w="75" w:type="dxa"/>
+              <w:left w:w="75" w:type="dxa"/>
+              <w:bottom w:w="75" w:type="dxa"/>
+              <w:right w:w="75" w:type="dxa"/>
+            </w:tcMar>
+          </w:tcPr>
+          <w:p>
+            <w:pPr>
+              <w:spacing w:after="40" w:before="40"/>
+              <w:jc w:val="center"/>
+            </w:pPr>
+            <w:r>
+              <w:rPr>
+                <w:rFonts w:ascii="Calibri" w:hAnsi="Calibri"/>
+                <w:b w:val="0"/>
+                <w:color w:val="000000"/>
+                <w:sz w:val="20"/>
+              </w:rPr>
+              <w:t>[n]</w:t>
+            </w:r>
+          </w:p>
+        </w:tc>
+        <w:tc>
+          <w:tcPr>
+            <w:tcW w:type="dxa" w:w="2304"/>
+            <w:shd w:fill="FFFFFF"/>
+            <w:tcBorders>
+              <w:top w:val="single" w:sz="4" w:color="D9D9D9"/>
+              <w:left w:val="single" w:sz="4" w:color="D9D9D9"/>
+              <w:bottom w:val="single" w:sz="4" w:color="D9D9D9"/>
+              <w:right w:val="single" w:sz="4" w:color="D9D9D9"/>
+            </w:tcBorders>
+            <w:tcMar>
+              <w:top w:w="75" w:type="dxa"/>
+              <w:left w:w="75" w:type="dxa"/>
+              <w:bottom w:w="75" w:type="dxa"/>
+              <w:right w:w="75" w:type="dxa"/>
+            </w:tcMar>
+          </w:tcPr>
+          <w:p>
+            <w:pPr>
+              <w:spacing w:after="40" w:before="40"/>
+              <w:jc w:val="center"/>
+            </w:pPr>
+            <w:r>
+              <w:rPr>
+                <w:rFonts w:ascii="Calibri" w:hAnsi="Calibri"/>
+                <w:b w:val="0"/>
+                <w:color w:val="000000"/>
+                <w:sz w:val="20"/>
+              </w:rPr>
+              <w:t>[%]</w:t>
+            </w:r>
+          </w:p>
+        </w:tc>
+        <w:tc>
+          <w:tcPr>
+            <w:tcW w:type="dxa" w:w="2376"/>
+            <w:shd w:fill="FFFFFF"/>
+            <w:tcBorders>
+              <w:top w:val="single" w:sz="4" w:color="D9D9D9"/>
+              <w:left w:val="single" w:sz="4" w:color="D9D9D9"/>
+              <w:bottom w:val="single" w:sz="4" w:color="D9D9D9"/>
+              <w:right w:val="single" w:sz="4" w:color="D9D9D9"/>
+            </w:tcBorders>
+            <w:tcMar>
+              <w:top w:w="75" w:type="dxa"/>
+              <w:left w:w="75" w:type="dxa"/>
+              <w:bottom w:w="75" w:type="dxa"/>
+              <w:right w:w="75" w:type="dxa"/>
+            </w:tcMar>
+          </w:tcPr>
+          <w:p>
+            <w:pPr>
+              <w:spacing w:after="40" w:before="40"/>
+              <w:jc w:val="center"/>
+            </w:pPr>
+            <w:r>
+              <w:rPr>
+                <w:rFonts w:ascii="Calibri" w:hAnsi="Calibri"/>
+                <w:b w:val="0"/>
+                <w:color w:val="000000"/>
+                <w:sz w:val="20"/>
+              </w:rPr>
+              <w:t>[%]</w:t>
+            </w:r>
+          </w:p>
+        </w:tc>
+      </w:tr>
+    </w:tbl>
+    <w:p>
+      <w:pPr>
+        <w:keepNext/>
+        <w:pageBreakBefore w:val="0"/>
+        <w:spacing w:after="120"/>
+      </w:pPr>
+      <w:r>
+        <w:rPr>
+          <w:rFonts w:ascii="Calibri" w:hAnsi="Calibri"/>
+          <w:b/>
+          <w:color w:val="000000"/>
+          <w:sz w:val="23"/>
+        </w:rPr>
+        <w:t>Group assignment rules</w:t>
+      </w:r>
+    </w:p>
+    <w:tbl>
+      <w:tblPr>
+        <w:tblW w:type="auto" w:w="0"/>
+        <w:tblLayout w:type="fixed"/>
+        <w:tblLook w:firstColumn="1" w:firstRow="1" w:lastColumn="0" w:lastRow="0" w:noHBand="0" w:noVBand="1" w:val="04A0"/>
+      </w:tblPr>
+      <w:tblGrid>
+        <w:gridCol w:w="6624"/>
+        <w:gridCol w:w="1512"/>
+        <w:gridCol w:w="1872"/>
+      </w:tblGrid>
+      <w:tr>
+        <w:trPr>
+          <w:tblHeader/>
+          <w:cantSplit/>
+        </w:trPr>
+        <w:tc>
+          <w:tcPr>
+            <w:tcW w:type="dxa" w:w="6624"/>
+            <w:shd w:fill="DDE9EE"/>
+            <w:tcBorders>
+              <w:top w:val="single" w:sz="4" w:color="D9D9D9"/>
+              <w:left w:val="single" w:sz="4" w:color="D9D9D9"/>
+              <w:bottom w:val="single" w:sz="4" w:color="D9D9D9"/>
+              <w:right w:val="single" w:sz="4" w:color="D9D9D9"/>
+            </w:tcBorders>
+            <w:tcMar>
+              <w:top w:w="75" w:type="dxa"/>
+              <w:left w:w="75" w:type="dxa"/>
+              <w:bottom w:w="75" w:type="dxa"/>
+              <w:right w:w="75" w:type="dxa"/>
+            </w:tcMar>
+          </w:tcPr>
+          <w:p>
+            <w:pPr>
+              <w:spacing w:after="40" w:before="40"/>
+            </w:pPr>
+            <w:r>
+              <w:rPr>
+                <w:rFonts w:ascii="Calibri" w:hAnsi="Calibri"/>
+                <w:b/>
+                <w:color w:val="000000"/>
+                <w:sz w:val="20"/>
+              </w:rPr>
+              <w:t>Plain-language rule</w:t>
+            </w:r>
+          </w:p>
+        </w:tc>
+        <w:tc>
+          <w:tcPr>
+            <w:tcW w:type="dxa" w:w="1512"/>
+            <w:shd w:fill="DDE9EE"/>
+            <w:tcBorders>
+              <w:top w:val="single" w:sz="4" w:color="D9D9D9"/>
+              <w:left w:val="single" w:sz="4" w:color="D9D9D9"/>
+              <w:bottom w:val="single" w:sz="4" w:color="D9D9D9"/>
+              <w:right w:val="single" w:sz="4" w:color="D9D9D9"/>
+            </w:tcBorders>
+            <w:tcMar>
+              <w:top w:w="75" w:type="dxa"/>
+              <w:left w:w="75" w:type="dxa"/>
+              <w:bottom w:w="75" w:type="dxa"/>
+              <w:right w:w="75" w:type="dxa"/>
+            </w:tcMar>
+          </w:tcPr>
+          <w:p>
+            <w:pPr>
+              <w:spacing w:after="40" w:before="40"/>
+              <w:jc w:val="center"/>
+            </w:pPr>
+            <w:r>
+              <w:rPr>
+                <w:rFonts w:ascii="Calibri" w:hAnsi="Calibri"/>
+                <w:b/>
+                <w:color w:val="000000"/>
+                <w:sz w:val="20"/>
+              </w:rPr>
+              <w:t>Confidence</w:t>
+            </w:r>
+          </w:p>
+        </w:tc>
+        <w:tc>
+          <w:tcPr>
+            <w:tcW w:type="dxa" w:w="1872"/>
+            <w:shd w:fill="DDE9EE"/>
+            <w:tcBorders>
+              <w:top w:val="single" w:sz="4" w:color="D9D9D9"/>
+              <w:left w:val="single" w:sz="4" w:color="D9D9D9"/>
+              <w:bottom w:val="single" w:sz="4" w:color="D9D9D9"/>
+              <w:right w:val="single" w:sz="4" w:color="D9D9D9"/>
+            </w:tcBorders>
+            <w:tcMar>
+              <w:top w:w="75" w:type="dxa"/>
+              <w:left w:w="75" w:type="dxa"/>
+              <w:bottom w:w="75" w:type="dxa"/>
+              <w:right w:w="75" w:type="dxa"/>
+            </w:tcMar>
+          </w:tcPr>
+          <w:p>
+            <w:pPr>
+              <w:spacing w:after="40" w:before="40"/>
+              <w:jc w:val="center"/>
+            </w:pPr>
+            <w:r>
+              <w:rPr>
+                <w:rFonts w:ascii="Calibri" w:hAnsi="Calibri"/>
+                <w:b/>
+                <w:color w:val="000000"/>
+                <w:sz w:val="20"/>
+              </w:rPr>
+              <w:t>PPR percentage</w:t>
+            </w:r>
+          </w:p>
+        </w:tc>
+      </w:tr>
+      <w:tr>
+        <w:trPr>
+          <w:cantSplit/>
+        </w:trPr>
+        <w:tc>
+          <w:tcPr>
+            <w:tcW w:type="dxa" w:w="6624"/>
+            <w:shd w:fill="FFFFFF"/>
+            <w:tcBorders>
+              <w:top w:val="single" w:sz="4" w:color="D9D9D9"/>
+              <w:left w:val="single" w:sz="4" w:color="D9D9D9"/>
+              <w:bottom w:val="single" w:sz="4" w:color="D9D9D9"/>
+              <w:right w:val="single" w:sz="4" w:color="D9D9D9"/>
+            </w:tcBorders>
+            <w:tcMar>
+              <w:top w:w="75" w:type="dxa"/>
+              <w:left w:w="75" w:type="dxa"/>
+              <w:bottom w:w="75" w:type="dxa"/>
+              <w:right w:w="75" w:type="dxa"/>
+            </w:tcMar>
+          </w:tcPr>
+          <w:p>
+            <w:pPr>
+              <w:spacing w:after="40" w:before="40"/>
+            </w:pPr>
+            <w:r>
+              <w:rPr>
+                <w:rFonts w:ascii="Calibri" w:hAnsi="Calibri"/>
+                <w:b w:val="0"/>
+                <w:color w:val="000000"/>
+                <w:sz w:val="20"/>
+              </w:rPr>
+              <w:t>[Rules in descending PPR coverage; highest first]</w:t>
+            </w:r>
+          </w:p>
+        </w:tc>
+        <w:tc>
+          <w:tcPr>
+            <w:tcW w:type="dxa" w:w="1512"/>
+            <w:shd w:fill="FFFFFF"/>
+            <w:tcBorders>
+              <w:top w:val="single" w:sz="4" w:color="D9D9D9"/>
+              <w:left w:val="single" w:sz="4" w:color="D9D9D9"/>
+              <w:bottom w:val="single" w:sz="4" w:color="D9D9D9"/>
+              <w:right w:val="single" w:sz="4" w:color="D9D9D9"/>
+            </w:tcBorders>
+            <w:tcMar>
+              <w:top w:w="75" w:type="dxa"/>
+              <w:left w:w="75" w:type="dxa"/>
+              <w:bottom w:w="75" w:type="dxa"/>
+              <w:right w:w="75" w:type="dxa"/>
+            </w:tcMar>
+          </w:tcPr>
+          <w:p>
+            <w:pPr>
+              <w:spacing w:after="40" w:before="40"/>
+              <w:jc w:val="center"/>
+            </w:pPr>
+            <w:r>
+              <w:rPr>
+                <w:rFonts w:ascii="Calibri" w:hAnsi="Calibri"/>
+                <w:b w:val="0"/>
+                <w:color w:val="000000"/>
+                <w:sz w:val="20"/>
+              </w:rPr>
+              <w:t>[Level]</w:t>
+            </w:r>
+          </w:p>
+        </w:tc>
+        <w:tc>
+          <w:tcPr>
+            <w:tcW w:type="dxa" w:w="1872"/>
+            <w:shd w:fill="FFFFFF"/>
+            <w:tcBorders>
+              <w:top w:val="single" w:sz="4" w:color="D9D9D9"/>
+              <w:left w:val="single" w:sz="4" w:color="D9D9D9"/>
+              <w:bottom w:val="single" w:sz="4" w:color="D9D9D9"/>
+              <w:right w:val="single" w:sz="4" w:color="D9D9D9"/>
+            </w:tcBorders>
+            <w:tcMar>
+              <w:top w:w="75" w:type="dxa"/>
+              <w:left w:w="75" w:type="dxa"/>
+              <w:bottom w:w="75" w:type="dxa"/>
+              <w:right w:w="75" w:type="dxa"/>
+            </w:tcMar>
+          </w:tcPr>
+          <w:p>
+            <w:pPr>
+              <w:spacing w:after="40" w:before="40"/>
+              <w:jc w:val="center"/>
+            </w:pPr>
+            <w:r>
+              <w:rPr>
+                <w:rFonts w:ascii="Calibri" w:hAnsi="Calibri"/>
+                <w:b w:val="0"/>
+                <w:color w:val="000000"/>
+                <w:sz w:val="20"/>
+              </w:rPr>
+              <w:t>[%]</w:t>
+            </w:r>
+          </w:p>
+        </w:tc>
+      </w:tr>
+      <w:tr>
+        <w:trPr>
+          <w:cantSplit/>
+        </w:trPr>
+        <w:tc>
+          <w:tcPr>
+            <w:tcW w:type="dxa" w:w="6624"/>
+            <w:shd w:fill="F5F7F8"/>
+            <w:tcBorders>
+              <w:top w:val="single" w:sz="4" w:color="D9D9D9"/>
+              <w:left w:val="single" w:sz="4" w:color="D9D9D9"/>
+              <w:bottom w:val="single" w:sz="4" w:color="D9D9D9"/>
+              <w:right w:val="single" w:sz="4" w:color="D9D9D9"/>
+            </w:tcBorders>
+            <w:tcMar>
+              <w:top w:w="75" w:type="dxa"/>
+              <w:left w:w="75" w:type="dxa"/>
+              <w:bottom w:w="75" w:type="dxa"/>
+              <w:right w:w="75" w:type="dxa"/>
+            </w:tcMar>
+          </w:tcPr>
+          <w:p>
+            <w:pPr>
+              <w:spacing w:after="40" w:before="40"/>
+            </w:pPr>
+            <w:r>
+              <w:rPr>
+                <w:rFonts w:ascii="Calibri" w:hAnsi="Calibri"/>
+                <w:b w:val="0"/>
+                <w:color w:val="000000"/>
+                <w:sz w:val="20"/>
+              </w:rPr>
+              <w:t>[Continue in descending order; include unresolved if used]</w:t>
+            </w:r>
+          </w:p>
+        </w:tc>
+        <w:tc>
+          <w:tcPr>
+            <w:tcW w:type="dxa" w:w="1512"/>
+            <w:shd w:fill="F5F7F8"/>
+            <w:tcBorders>
+              <w:top w:val="single" w:sz="4" w:color="D9D9D9"/>
+              <w:left w:val="single" w:sz="4" w:color="D9D9D9"/>
+              <w:bottom w:val="single" w:sz="4" w:color="D9D9D9"/>
+              <w:right w:val="single" w:sz="4" w:color="D9D9D9"/>
+            </w:tcBorders>
+            <w:tcMar>
+              <w:top w:w="75" w:type="dxa"/>
+              <w:left w:w="75" w:type="dxa"/>
+              <w:bottom w:w="75" w:type="dxa"/>
+              <w:right w:w="75" w:type="dxa"/>
+            </w:tcMar>
+          </w:tcPr>
+          <w:p>
+            <w:pPr>
+              <w:spacing w:after="40" w:before="40"/>
+              <w:jc w:val="center"/>
+            </w:pPr>
+            <w:r>
+              <w:rPr>
+                <w:rFonts w:ascii="Calibri" w:hAnsi="Calibri"/>
+                <w:b w:val="0"/>
+                <w:color w:val="000000"/>
+                <w:sz w:val="20"/>
+              </w:rPr>
+              <w:t>[Level]</w:t>
+            </w:r>
+          </w:p>
+        </w:tc>
+        <w:tc>
+          <w:tcPr>
+            <w:tcW w:type="dxa" w:w="1872"/>
+            <w:shd w:fill="F5F7F8"/>
+            <w:tcBorders>
+              <w:top w:val="single" w:sz="4" w:color="D9D9D9"/>
+              <w:left w:val="single" w:sz="4" w:color="D9D9D9"/>
+              <w:bottom w:val="single" w:sz="4" w:color="D9D9D9"/>
+              <w:right w:val="single" w:sz="4" w:color="D9D9D9"/>
+            </w:tcBorders>
+            <w:tcMar>
+              <w:top w:w="75" w:type="dxa"/>
+              <w:left w:w="75" w:type="dxa"/>
+              <w:bottom w:w="75" w:type="dxa"/>
+              <w:right w:w="75" w:type="dxa"/>
+            </w:tcMar>
+          </w:tcPr>
+          <w:p>
+            <w:pPr>
+              <w:spacing w:after="40" w:before="40"/>
+              <w:jc w:val="center"/>
+            </w:pPr>
+            <w:r>
+              <w:rPr>
+                <w:rFonts w:ascii="Calibri" w:hAnsi="Calibri"/>
+                <w:b w:val="0"/>
+                <w:color w:val="000000"/>
+                <w:sz w:val="20"/>
+              </w:rPr>
+              <w:t>[%]</w:t>
+            </w:r>
+          </w:p>
+        </w:tc>
+      </w:tr>
+    </w:tbl>
+    <w:p>
+      <w:pPr>
+        <w:keepNext w:val="0"/>
+        <w:pageBreakBefore w:val="0"/>
+        <w:spacing w:after="120"/>
+      </w:pPr>
+      <w:r>
+        <w:rPr>
+          <w:rFonts w:ascii="Calibri" w:hAnsi="Calibri"/>
+          <w:b w:val="0"/>
+          <w:color w:val="000000"/>
+          <w:sz w:val="21"/>
+        </w:rPr>
+        <w:t>[Add a Sum row only if the PPR percentages do not total 100%; otherwise omit it.]</w:t>
+      </w:r>
+    </w:p>
+    <w:p>
+      <w:pPr>
+        <w:keepNext/>
+        <w:pageBreakBefore w:val="0"/>
+        <w:spacing w:after="120"/>
+      </w:pPr>
+      <w:r>
+        <w:rPr>
+          <w:rFonts w:ascii="Calibri" w:hAnsi="Calibri"/>
+          <w:b/>
+          <w:color w:val="000000"/>
+          <w:sz w:val="23"/>
+        </w:rPr>
+        <w:t>Allocation weight rules</w:t>
+      </w:r>
+    </w:p>
+    <w:tbl>
+      <w:tblPr>
+        <w:tblW w:type="auto" w:w="0"/>
+        <w:tblLayout w:type="fixed"/>
+        <w:tblLook w:firstColumn="1" w:firstRow="1" w:lastColumn="0" w:lastRow="0" w:noHBand="0" w:noVBand="1" w:val="04A0"/>
+      </w:tblPr>
+      <w:tblGrid>
+        <w:gridCol w:w="6624"/>
+        <w:gridCol w:w="1512"/>
+        <w:gridCol w:w="1872"/>
+      </w:tblGrid>
+      <w:tr>
+        <w:trPr>
+          <w:tblHeader/>
+          <w:cantSplit/>
+        </w:trPr>
+        <w:tc>
+          <w:tcPr>
+            <w:tcW w:type="dxa" w:w="6624"/>
+            <w:shd w:fill="DDE9EE"/>
+            <w:tcBorders>
+              <w:top w:val="single" w:sz="4" w:color="D9D9D9"/>
+              <w:left w:val="single" w:sz="4" w:color="D9D9D9"/>
+              <w:bottom w:val="single" w:sz="4" w:color="D9D9D9"/>
+              <w:right w:val="single" w:sz="4" w:color="D9D9D9"/>
+            </w:tcBorders>
+            <w:tcMar>
+              <w:top w:w="75" w:type="dxa"/>
+              <w:left w:w="75" w:type="dxa"/>
+              <w:bottom w:w="75" w:type="dxa"/>
+              <w:right w:w="75" w:type="dxa"/>
+            </w:tcMar>
+          </w:tcPr>
+          <w:p>
+            <w:pPr>
+              <w:spacing w:after="40" w:before="40"/>
+            </w:pPr>
+            <w:r>
+              <w:rPr>
+                <w:rFonts w:ascii="Calibri" w:hAnsi="Calibri"/>
+                <w:b/>
+                <w:color w:val="000000"/>
+                <w:sz w:val="20"/>
+              </w:rPr>
+              <w:t>Plain-language rule</w:t>
+            </w:r>
+          </w:p>
+        </w:tc>
+        <w:tc>
+          <w:tcPr>
+            <w:tcW w:type="dxa" w:w="1512"/>
+            <w:shd w:fill="DDE9EE"/>
+            <w:tcBorders>
+              <w:top w:val="single" w:sz="4" w:color="D9D9D9"/>
+              <w:left w:val="single" w:sz="4" w:color="D9D9D9"/>
+              <w:bottom w:val="single" w:sz="4" w:color="D9D9D9"/>
+              <w:right w:val="single" w:sz="4" w:color="D9D9D9"/>
+            </w:tcBorders>
+            <w:tcMar>
+              <w:top w:w="75" w:type="dxa"/>
+              <w:left w:w="75" w:type="dxa"/>
+              <w:bottom w:w="75" w:type="dxa"/>
+              <w:right w:w="75" w:type="dxa"/>
+            </w:tcMar>
+          </w:tcPr>
+          <w:p>
+            <w:pPr>
+              <w:spacing w:after="40" w:before="40"/>
+              <w:jc w:val="center"/>
+            </w:pPr>
+            <w:r>
+              <w:rPr>
+                <w:rFonts w:ascii="Calibri" w:hAnsi="Calibri"/>
+                <w:b/>
+                <w:color w:val="000000"/>
+                <w:sz w:val="20"/>
+              </w:rPr>
+              <w:t>Confidence</w:t>
+            </w:r>
+          </w:p>
+        </w:tc>
+        <w:tc>
+          <w:tcPr>
+            <w:tcW w:type="dxa" w:w="1872"/>
+            <w:shd w:fill="DDE9EE"/>
+            <w:tcBorders>
+              <w:top w:val="single" w:sz="4" w:color="D9D9D9"/>
+              <w:left w:val="single" w:sz="4" w:color="D9D9D9"/>
+              <w:bottom w:val="single" w:sz="4" w:color="D9D9D9"/>
+              <w:right w:val="single" w:sz="4" w:color="D9D9D9"/>
+            </w:tcBorders>
+            <w:tcMar>
+              <w:top w:w="75" w:type="dxa"/>
+              <w:left w:w="75" w:type="dxa"/>
+              <w:bottom w:w="75" w:type="dxa"/>
+              <w:right w:w="75" w:type="dxa"/>
+            </w:tcMar>
+          </w:tcPr>
+          <w:p>
+            <w:pPr>
+              <w:spacing w:after="40" w:before="40"/>
+              <w:jc w:val="center"/>
+            </w:pPr>
+            <w:r>
+              <w:rPr>
+                <w:rFonts w:ascii="Calibri" w:hAnsi="Calibri"/>
+                <w:b/>
+                <w:color w:val="000000"/>
+                <w:sz w:val="20"/>
+              </w:rPr>
+              <w:t>PPR percentage</w:t>
+            </w:r>
+          </w:p>
+        </w:tc>
+      </w:tr>
+      <w:tr>
+        <w:trPr>
+          <w:cantSplit/>
+        </w:trPr>
+        <w:tc>
+          <w:tcPr>
+            <w:tcW w:type="dxa" w:w="6624"/>
+            <w:shd w:fill="FFFFFF"/>
+            <w:tcBorders>
+              <w:top w:val="single" w:sz="4" w:color="D9D9D9"/>
+              <w:left w:val="single" w:sz="4" w:color="D9D9D9"/>
+              <w:bottom w:val="single" w:sz="4" w:color="D9D9D9"/>
+              <w:right w:val="single" w:sz="4" w:color="D9D9D9"/>
+            </w:tcBorders>
+            <w:tcMar>
+              <w:top w:w="75" w:type="dxa"/>
+              <w:left w:w="75" w:type="dxa"/>
+              <w:bottom w:w="75" w:type="dxa"/>
+              <w:right w:w="75" w:type="dxa"/>
+            </w:tcMar>
+          </w:tcPr>
+          <w:p>
+            <w:pPr>
+              <w:spacing w:after="40" w:before="40"/>
+            </w:pPr>
+            <w:r>
+              <w:rPr>
+                <w:rFonts w:ascii="Calibri" w:hAnsi="Calibri"/>
+                <w:b w:val="0"/>
+                <w:color w:val="000000"/>
+                <w:sz w:val="20"/>
+              </w:rPr>
+              <w:t>[Every actual allocation rule in full words]</w:t>
+            </w:r>
+          </w:p>
+        </w:tc>
+        <w:tc>
+          <w:tcPr>
+            <w:tcW w:type="dxa" w:w="1512"/>
+            <w:shd w:fill="FFFFFF"/>
+            <w:tcBorders>
+              <w:top w:val="single" w:sz="4" w:color="D9D9D9"/>
+              <w:left w:val="single" w:sz="4" w:color="D9D9D9"/>
+              <w:bottom w:val="single" w:sz="4" w:color="D9D9D9"/>
+              <w:right w:val="single" w:sz="4" w:color="D9D9D9"/>
+            </w:tcBorders>
+            <w:tcMar>
+              <w:top w:w="75" w:type="dxa"/>
+              <w:left w:w="75" w:type="dxa"/>
+              <w:bottom w:w="75" w:type="dxa"/>
+              <w:right w:w="75" w:type="dxa"/>
+            </w:tcMar>
+          </w:tcPr>
+          <w:p>
+            <w:pPr>
+              <w:spacing w:after="40" w:before="40"/>
+              <w:jc w:val="center"/>
+            </w:pPr>
+            <w:r>
+              <w:rPr>
+                <w:rFonts w:ascii="Calibri" w:hAnsi="Calibri"/>
+                <w:b w:val="0"/>
+                <w:color w:val="000000"/>
+                <w:sz w:val="20"/>
+              </w:rPr>
+              <w:t>[Level]</w:t>
+            </w:r>
+          </w:p>
+        </w:tc>
+        <w:tc>
+          <w:tcPr>
+            <w:tcW w:type="dxa" w:w="1872"/>
+            <w:shd w:fill="FFFFFF"/>
+            <w:tcBorders>
+              <w:top w:val="single" w:sz="4" w:color="D9D9D9"/>
+              <w:left w:val="single" w:sz="4" w:color="D9D9D9"/>
+              <w:bottom w:val="single" w:sz="4" w:color="D9D9D9"/>
+              <w:right w:val="single" w:sz="4" w:color="D9D9D9"/>
+            </w:tcBorders>
+            <w:tcMar>
+              <w:top w:w="75" w:type="dxa"/>
+              <w:left w:w="75" w:type="dxa"/>
+              <w:bottom w:w="75" w:type="dxa"/>
+              <w:right w:w="75" w:type="dxa"/>
+            </w:tcMar>
+          </w:tcPr>
+          <w:p>
+            <w:pPr>
+              <w:spacing w:after="40" w:before="40"/>
+              <w:jc w:val="center"/>
+            </w:pPr>
+            <w:r>
+              <w:rPr>
+                <w:rFonts w:ascii="Calibri" w:hAnsi="Calibri"/>
+                <w:b w:val="0"/>
+                <w:color w:val="000000"/>
+                <w:sz w:val="20"/>
+              </w:rPr>
+              <w:t>[%]</w:t>
+            </w:r>
+          </w:p>
+        </w:tc>
+      </w:tr>
+      <w:tr>
+        <w:trPr>
+          <w:cantSplit/>
+        </w:trPr>
+        <w:tc>
+          <w:tcPr>
+            <w:tcW w:type="dxa" w:w="6624"/>
+            <w:shd w:fill="F5F7F8"/>
+            <w:tcBorders>
+              <w:top w:val="single" w:sz="4" w:color="D9D9D9"/>
+              <w:left w:val="single" w:sz="4" w:color="D9D9D9"/>
+              <w:bottom w:val="single" w:sz="4" w:color="D9D9D9"/>
+              <w:right w:val="single" w:sz="4" w:color="D9D9D9"/>
+            </w:tcBorders>
+            <w:tcMar>
+              <w:top w:w="75" w:type="dxa"/>
+              <w:left w:w="75" w:type="dxa"/>
+              <w:bottom w:w="75" w:type="dxa"/>
+              <w:right w:w="75" w:type="dxa"/>
+            </w:tcMar>
+          </w:tcPr>
+          <w:p>
+            <w:pPr>
+              <w:spacing w:after="40" w:before="40"/>
+            </w:pPr>
+            <w:r>
+              <w:rPr>
+                <w:rFonts w:ascii="Calibri" w:hAnsi="Calibri"/>
+                <w:b w:val="0"/>
+                <w:color w:val="000000"/>
+                <w:sz w:val="20"/>
+              </w:rPr>
+              <w:t>[Unresolved or not applicable where used]</w:t>
+            </w:r>
+          </w:p>
+        </w:tc>
+        <w:tc>
+          <w:tcPr>
+            <w:tcW w:type="dxa" w:w="1512"/>
+            <w:shd w:fill="F5F7F8"/>
+            <w:tcBorders>
+              <w:top w:val="single" w:sz="4" w:color="D9D9D9"/>
+              <w:left w:val="single" w:sz="4" w:color="D9D9D9"/>
+              <w:bottom w:val="single" w:sz="4" w:color="D9D9D9"/>
+              <w:right w:val="single" w:sz="4" w:color="D9D9D9"/>
+            </w:tcBorders>
+            <w:tcMar>
+              <w:top w:w="75" w:type="dxa"/>
+              <w:left w:w="75" w:type="dxa"/>
+              <w:bottom w:w="75" w:type="dxa"/>
+              <w:right w:w="75" w:type="dxa"/>
+            </w:tcMar>
+          </w:tcPr>
+          <w:p>
+            <w:pPr>
+              <w:spacing w:after="40" w:before="40"/>
+              <w:jc w:val="center"/>
+            </w:pPr>
+            <w:r>
+              <w:rPr>
+                <w:rFonts w:ascii="Calibri" w:hAnsi="Calibri"/>
+                <w:b w:val="0"/>
+                <w:color w:val="000000"/>
+                <w:sz w:val="20"/>
+              </w:rPr>
+              <w:t>[Level]</w:t>
+            </w:r>
+          </w:p>
+        </w:tc>
+        <w:tc>
+          <w:tcPr>
+            <w:tcW w:type="dxa" w:w="1872"/>
+            <w:shd w:fill="F5F7F8"/>
+            <w:tcBorders>
+              <w:top w:val="single" w:sz="4" w:color="D9D9D9"/>
+              <w:left w:val="single" w:sz="4" w:color="D9D9D9"/>
+              <w:bottom w:val="single" w:sz="4" w:color="D9D9D9"/>
+              <w:right w:val="single" w:sz="4" w:color="D9D9D9"/>
+            </w:tcBorders>
+            <w:tcMar>
+              <w:top w:w="75" w:type="dxa"/>
+              <w:left w:w="75" w:type="dxa"/>
+              <w:bottom w:w="75" w:type="dxa"/>
+              <w:right w:w="75" w:type="dxa"/>
+            </w:tcMar>
+          </w:tcPr>
+          <w:p>
+            <w:pPr>
+              <w:spacing w:after="40" w:before="40"/>
+              <w:jc w:val="center"/>
+            </w:pPr>
+            <w:r>
+              <w:rPr>
+                <w:rFonts w:ascii="Calibri" w:hAnsi="Calibri"/>
+                <w:b w:val="0"/>
+                <w:color w:val="000000"/>
+                <w:sz w:val="20"/>
+              </w:rPr>
+              <w:t>[%]</w:t>
+            </w:r>
+          </w:p>
+        </w:tc>
+      </w:tr>
+    </w:tbl>
+    <w:p>
+      <w:pPr>
+        <w:keepNext w:val="0"/>
+        <w:pageBreakBefore w:val="0"/>
+        <w:spacing w:after="120"/>
+      </w:pPr>
+      <w:r>
+        <w:rPr>
+          <w:rFonts w:ascii="Calibri" w:hAnsi="Calibri"/>
+          <w:b w:val="0"/>
+          <w:color w:val="000000"/>
+          <w:sz w:val="21"/>
+        </w:rPr>
+        <w:t>Each table covers the same known simple-chain PPR universe once. Percentages describe taxa using each rule; mapping weights do not generate classic PPR. Do not add the two tables. [Describe assumptions and link full sources.]</w:t>
+      </w:r>
+    </w:p>
+    <w:p>
+      <w:pPr>
+        <w:keepNext w:val="0"/>
+        <w:pageBreakBefore w:val="0"/>
+        <w:spacing w:after="120"/>
+      </w:pPr>
+      <w:r>
+        <w:rPr>
+          <w:rFonts w:ascii="Calibri" w:hAnsi="Calibri"/>
+          <w:b w:val="0"/>
+          <w:color w:val="000000"/>
+          <w:sz w:val="21"/>
+        </w:rPr>
+        <w:t>[Unresolved taxa: name each and give a short reason, or state none. Very low decisions: group by assumption, name the taxa or link exact appendix rows, and give their catch/PPR share. Scientific findings only; keep workflow and verification details in supporting records.]</w:t>
+      </w:r>
+    </w:p>
+    <w:p>
+      <w:pPr>
         <w:pStyle w:val="Title"/>
         <w:pageBreakBefore/>
         <w:keepNext/>
+        <w:pageBreakBefore/>
       </w:pPr>
       <w:r>
         <w:t>Geographic evidence screenshots</w:t>
@@ -2517,626 +3323,9 @@
         <w:t xml:space="preserve">[If a figure is unavailable, state the missing source or reason.]</w:t>
       </w:r>
     </w:p>
-    <w:p>
-      <w:pPr>
-        <w:spacing w:after="40" w:before="0" w:line="240" w:lineRule="auto"/>
-        <w:sectPr>
-          <w:type w:val="nextPage"/>
-          <w:pgSz w:w="11909" w:h="16834"/>
-          <w:pgMar w:top="936" w:right="936" w:bottom="936" w:left="936" w:header="720" w:footer="720" w:gutter="0"/>
-          <w:cols w:space="720"/>
-          <w:docGrid w:linePitch="360"/>
-        </w:sectPr>
-      </w:pPr>
-      <w:r>
-        <w:rPr>
-          <w:rFonts w:ascii="Calibri" w:hAnsi="Calibri"/>
-          <w:sz w:val="2"/>
-          <w:color w:val="000000"/>
-        </w:rPr>
-        <w:t xml:space="preserve"/>
-      </w:r>
-    </w:p>
-    <w:p>
-      <w:pPr>
-        <w:pStyle w:val="Heading1"/>
-        <w:spacing w:after="40" w:before="0" w:line="240" w:lineRule="auto"/>
-      </w:pPr>
-      <w:r>
-        <w:rPr>
-          <w:rFonts w:ascii="Calibri" w:hAnsi="Calibri"/>
-          <w:sz w:val="34"/>
-          <w:color w:val="000000"/>
-        </w:rPr>
-        <w:t xml:space="preserve">Appendix A Taxon mappings</w:t>
-      </w:r>
-    </w:p>
-    <w:p>
-      <w:pPr>
-        <w:spacing w:after="40" w:before="0" w:line="240" w:lineRule="auto"/>
-      </w:pPr>
-      <w:r>
-        <w:rPr>
-          <w:rFonts w:ascii="Calibri" w:hAnsi="Calibri"/>
-          <w:sz w:val="21"/>
-          <w:color w:val="000000"/>
-        </w:rPr>
-        <w:t xml:space="preserve">Reference: [year]; [catch basis]. Simple-chain PPR: [method; transfer efficiency; carbon conversion; sources].</w:t>
-      </w:r>
-    </w:p>
-    <w:p>
-      <w:pPr>
-        <w:spacing w:after="40" w:before="0" w:line="240" w:lineRule="auto"/>
-      </w:pPr>
-      <w:r>
-        <w:rPr>
-          <w:rFonts w:ascii="Calibri" w:hAnsi="Calibri"/>
-          <w:sz w:val="21"/>
-          <w:color w:val="000000"/>
-        </w:rPr>
-        <w:t xml:space="preserve">Catch in tonnes; PPR in tonnes C. ? = unavailable or unresolved. [Missing-PPR coverage, if applicable.]</w:t>
-      </w:r>
-    </w:p>
-    <w:p>
-      <w:pPr>
-        <w:spacing w:after="40" w:before="0" w:line="240" w:lineRule="auto"/>
-      </w:pPr>
-      <w:r>
-        <w:rPr>
-          <w:rFonts w:ascii="Calibri" w:hAnsi="Calibri"/>
-          <w:sz w:val="21"/>
-          <w:color w:val="000000"/>
-        </w:rPr>
-        <w:t xml:space="preserve">Sorted by simple-chain PPR, descending; unavailable values last.</w:t>
-      </w:r>
-    </w:p>
-    <w:tbl>
-      <w:tblPr>
-        <w:tblW w:type="dxa" w:w="14962"/>
-        <w:jc w:val="center"/>
-        <w:tblLayout w:type="fixed"/>
-        <w:tblLook w:firstColumn="1" w:firstRow="1" w:lastColumn="0" w:lastRow="0" w:noHBand="0" w:noVBand="1" w:val="04A0"/>
-      </w:tblPr>
-      <w:tblGrid>
-        <w:gridCol w:w="2304"/>
-        <w:gridCol w:w="720"/>
-        <w:gridCol w:w="1296"/>
-        <w:gridCol w:w="1800"/>
-        <w:gridCol w:w="3096"/>
-        <w:gridCol w:w="1368"/>
-        <w:gridCol w:w="4378"/>
-      </w:tblGrid>
-      <w:tr>
-        <w:trPr>
-          <w:cantSplit/>
-          <w:tblHeader/>
-        </w:trPr>
-        <w:tc>
-          <w:tcPr>
-            <w:tcW w:type="dxa" w:w="2304"/>
-            <w:vAlign w:val="center"/>
-            <w:shd w:fill="E5ECF0"/>
-            <w:tcMar>
-              <w:top w:w="90" w:type="dxa"/>
-              <w:bottom w:w="90" w:type="dxa"/>
-              <w:left w:w="110" w:type="dxa"/>
-              <w:right w:w="110" w:type="dxa"/>
-            </w:tcMar>
-            <w:tcBorders>
-              <w:top w:val="single" w:sz="5" w:color="D9D9D9"/>
-              <w:left w:val="single" w:sz="5" w:color="D9D9D9"/>
-              <w:bottom w:val="single" w:sz="5" w:color="D9D9D9"/>
-              <w:right w:val="single" w:sz="5" w:color="D9D9D9"/>
-            </w:tcBorders>
-          </w:tcPr>
-          <w:p>
-            <w:pPr>
-              <w:spacing w:after="40" w:before="0" w:line="240" w:lineRule="auto"/>
-            </w:pPr>
-            <w:r>
-              <w:rPr>
-                <w:rFonts w:ascii="Calibri" w:hAnsi="Calibri"/>
-                <w:sz w:val="20"/>
-                <w:color w:val="000000"/>
-                <w:b/>
-              </w:rPr>
-              <w:t xml:space="preserve">Taxon name</w:t>
-            </w:r>
-          </w:p>
-        </w:tc>
-        <w:tc>
-          <w:tcPr>
-            <w:tcW w:type="dxa" w:w="720"/>
-            <w:vAlign w:val="center"/>
-            <w:shd w:fill="E5ECF0"/>
-            <w:tcMar>
-              <w:top w:w="90" w:type="dxa"/>
-              <w:bottom w:w="90" w:type="dxa"/>
-              <w:left w:w="110" w:type="dxa"/>
-              <w:right w:w="110" w:type="dxa"/>
-            </w:tcMar>
-            <w:tcBorders>
-              <w:top w:val="single" w:sz="5" w:color="D9D9D9"/>
-              <w:left w:val="single" w:sz="5" w:color="D9D9D9"/>
-              <w:bottom w:val="single" w:sz="5" w:color="D9D9D9"/>
-              <w:right w:val="single" w:sz="5" w:color="D9D9D9"/>
-            </w:tcBorders>
-          </w:tcPr>
-          <w:p>
-            <w:pPr>
-              <w:spacing w:after="40" w:before="0" w:line="240" w:lineRule="auto"/>
-            </w:pPr>
-            <w:r>
-              <w:rPr>
-                <w:rFonts w:ascii="Calibri" w:hAnsi="Calibri"/>
-                <w:sz w:val="20"/>
-                <w:color w:val="000000"/>
-                <w:b/>
-              </w:rPr>
-              <w:t xml:space="preserve">TL</w:t>
-            </w:r>
-          </w:p>
-        </w:tc>
-        <w:tc>
-          <w:tcPr>
-            <w:tcW w:type="dxa" w:w="1296"/>
-            <w:vAlign w:val="center"/>
-            <w:shd w:fill="E5ECF0"/>
-            <w:tcMar>
-              <w:top w:w="90" w:type="dxa"/>
-              <w:bottom w:w="90" w:type="dxa"/>
-              <w:left w:w="110" w:type="dxa"/>
-              <w:right w:w="110" w:type="dxa"/>
-            </w:tcMar>
-            <w:tcBorders>
-              <w:top w:val="single" w:sz="5" w:color="D9D9D9"/>
-              <w:left w:val="single" w:sz="5" w:color="D9D9D9"/>
-              <w:bottom w:val="single" w:sz="5" w:color="D9D9D9"/>
-              <w:right w:val="single" w:sz="5" w:color="D9D9D9"/>
-            </w:tcBorders>
-          </w:tcPr>
-          <w:p>
-            <w:pPr>
-              <w:spacing w:after="40" w:before="0" w:line="240" w:lineRule="auto"/>
-            </w:pPr>
-            <w:r>
-              <w:rPr>
-                <w:rFonts w:ascii="Calibri" w:hAnsi="Calibri"/>
-                <w:sz w:val="20"/>
-                <w:color w:val="000000"/>
-                <w:b/>
-              </w:rPr>
-              <w:t xml:space="preserve">Catch</w:t>
-              <w:br/>
-              <w:t xml:space="preserve">(t)</w:t>
-            </w:r>
-          </w:p>
-        </w:tc>
-        <w:tc>
-          <w:tcPr>
-            <w:tcW w:type="dxa" w:w="1800"/>
-            <w:vAlign w:val="center"/>
-            <w:shd w:fill="E5ECF0"/>
-            <w:tcMar>
-              <w:top w:w="90" w:type="dxa"/>
-              <w:bottom w:w="90" w:type="dxa"/>
-              <w:left w:w="110" w:type="dxa"/>
-              <w:right w:w="110" w:type="dxa"/>
-            </w:tcMar>
-            <w:tcBorders>
-              <w:top w:val="single" w:sz="5" w:color="D9D9D9"/>
-              <w:left w:val="single" w:sz="5" w:color="D9D9D9"/>
-              <w:bottom w:val="single" w:sz="5" w:color="D9D9D9"/>
-              <w:right w:val="single" w:sz="5" w:color="D9D9D9"/>
-            </w:tcBorders>
-          </w:tcPr>
-          <w:p>
-            <w:pPr>
-              <w:spacing w:after="40" w:before="0" w:line="240" w:lineRule="auto"/>
-            </w:pPr>
-            <w:r>
-              <w:rPr>
-                <w:rFonts w:ascii="Calibri" w:hAnsi="Calibri"/>
-                <w:sz w:val="20"/>
-                <w:color w:val="000000"/>
-                <w:b/>
-              </w:rPr>
-              <w:t xml:space="preserve">Simple-chain</w:t>
-              <w:br/>
-              <w:t xml:space="preserve">PPR (t C)</w:t>
-            </w:r>
-          </w:p>
-        </w:tc>
-        <w:tc>
-          <w:tcPr>
-            <w:tcW w:type="dxa" w:w="3096"/>
-            <w:vAlign w:val="center"/>
-            <w:shd w:fill="E5ECF0"/>
-            <w:tcMar>
-              <w:top w:w="90" w:type="dxa"/>
-              <w:bottom w:w="90" w:type="dxa"/>
-              <w:left w:w="110" w:type="dxa"/>
-              <w:right w:w="110" w:type="dxa"/>
-            </w:tcMar>
-            <w:tcBorders>
-              <w:top w:val="single" w:sz="5" w:color="D9D9D9"/>
-              <w:left w:val="single" w:sz="5" w:color="D9D9D9"/>
-              <w:bottom w:val="single" w:sz="5" w:color="D9D9D9"/>
-              <w:right w:val="single" w:sz="5" w:color="D9D9D9"/>
-            </w:tcBorders>
-          </w:tcPr>
-          <w:p>
-            <w:pPr>
-              <w:spacing w:after="40" w:before="0" w:line="240" w:lineRule="auto"/>
-            </w:pPr>
-            <w:r>
-              <w:rPr>
-                <w:rFonts w:ascii="Calibri" w:hAnsi="Calibri"/>
-                <w:sz w:val="20"/>
-                <w:color w:val="000000"/>
-                <w:b/>
-              </w:rPr>
-              <w:t xml:space="preserve">Mapped group names</w:t>
-              <w:br/>
-              <w:t xml:space="preserve">and weights</w:t>
-            </w:r>
-          </w:p>
-        </w:tc>
-        <w:tc>
-          <w:tcPr>
-            <w:tcW w:type="dxa" w:w="1368"/>
-            <w:vAlign w:val="center"/>
-            <w:shd w:fill="E5ECF0"/>
-            <w:tcMar>
-              <w:top w:w="90" w:type="dxa"/>
-              <w:bottom w:w="90" w:type="dxa"/>
-              <w:left w:w="110" w:type="dxa"/>
-              <w:right w:w="110" w:type="dxa"/>
-            </w:tcMar>
-            <w:tcBorders>
-              <w:top w:val="single" w:sz="5" w:color="D9D9D9"/>
-              <w:left w:val="single" w:sz="5" w:color="D9D9D9"/>
-              <w:bottom w:val="single" w:sz="5" w:color="D9D9D9"/>
-              <w:right w:val="single" w:sz="5" w:color="D9D9D9"/>
-            </w:tcBorders>
-          </w:tcPr>
-          <w:p>
-            <w:pPr>
-              <w:spacing w:after="40" w:before="0" w:line="240" w:lineRule="auto"/>
-            </w:pPr>
-            <w:r>
-              <w:rPr>
-                <w:rFonts w:ascii="Calibri" w:hAnsi="Calibri"/>
-                <w:sz w:val="20"/>
-                <w:color w:val="000000"/>
-                <w:b/>
-              </w:rPr>
-              <w:t xml:space="preserve">Confidence</w:t>
-              <w:br/>
-              <w:t xml:space="preserve">level</w:t>
-            </w:r>
-          </w:p>
-        </w:tc>
-        <w:tc>
-          <w:tcPr>
-            <w:tcW w:type="dxa" w:w="4378"/>
-            <w:vAlign w:val="center"/>
-            <w:shd w:fill="E5ECF0"/>
-            <w:tcMar>
-              <w:top w:w="90" w:type="dxa"/>
-              <w:bottom w:w="90" w:type="dxa"/>
-              <w:left w:w="110" w:type="dxa"/>
-              <w:right w:w="110" w:type="dxa"/>
-            </w:tcMar>
-            <w:tcBorders>
-              <w:top w:val="single" w:sz="5" w:color="D9D9D9"/>
-              <w:left w:val="single" w:sz="5" w:color="D9D9D9"/>
-              <w:bottom w:val="single" w:sz="5" w:color="D9D9D9"/>
-              <w:right w:val="single" w:sz="5" w:color="D9D9D9"/>
-            </w:tcBorders>
-          </w:tcPr>
-          <w:p>
-            <w:pPr>
-              <w:spacing w:after="40" w:before="0" w:line="240" w:lineRule="auto"/>
-            </w:pPr>
-            <w:r>
-              <w:rPr>
-                <w:rFonts w:ascii="Calibri" w:hAnsi="Calibri"/>
-                <w:sz w:val="20"/>
-                <w:color w:val="000000"/>
-                <w:b/>
-              </w:rPr>
-              <w:t xml:space="preserve">Reason</w:t>
-            </w:r>
-          </w:p>
-        </w:tc>
-      </w:tr>
-      <w:tr>
-        <w:trPr>
-          <w:cantSplit/>
-        </w:trPr>
-        <w:tc>
-          <w:tcPr>
-            <w:tcW w:type="dxa" w:w="2304"/>
-            <w:vAlign w:val="center"/>
-            <w:shd w:fill="FFFFFF"/>
-            <w:tcMar>
-              <w:top w:w="90" w:type="dxa"/>
-              <w:bottom w:w="90" w:type="dxa"/>
-              <w:left w:w="110" w:type="dxa"/>
-              <w:right w:w="110" w:type="dxa"/>
-            </w:tcMar>
-            <w:tcBorders>
-              <w:top w:val="single" w:sz="5" w:color="D9D9D9"/>
-              <w:left w:val="single" w:sz="5" w:color="D9D9D9"/>
-              <w:bottom w:val="single" w:sz="5" w:color="D9D9D9"/>
-              <w:right w:val="single" w:sz="5" w:color="D9D9D9"/>
-            </w:tcBorders>
-          </w:tcPr>
-          <w:p>
-            <w:pPr>
-              <w:spacing w:after="40" w:before="0" w:line="240" w:lineRule="auto"/>
-            </w:pPr>
-            <w:r>
-              <w:rPr>
-                <w:rFonts w:ascii="Calibri" w:hAnsi="Calibri"/>
-                <w:sz w:val="20"/>
-                <w:color w:val="000000"/>
-              </w:rPr>
-              <w:t xml:space="preserve">[Catch taxon]</w:t>
-            </w:r>
-          </w:p>
-        </w:tc>
-        <w:tc>
-          <w:tcPr>
-            <w:tcW w:type="dxa" w:w="720"/>
-            <w:vAlign w:val="center"/>
-            <w:shd w:fill="FFFFFF"/>
-            <w:tcMar>
-              <w:top w:w="90" w:type="dxa"/>
-              <w:bottom w:w="90" w:type="dxa"/>
-              <w:left w:w="110" w:type="dxa"/>
-              <w:right w:w="110" w:type="dxa"/>
-            </w:tcMar>
-            <w:tcBorders>
-              <w:top w:val="single" w:sz="5" w:color="D9D9D9"/>
-              <w:left w:val="single" w:sz="5" w:color="D9D9D9"/>
-              <w:bottom w:val="single" w:sz="5" w:color="D9D9D9"/>
-              <w:right w:val="single" w:sz="5" w:color="D9D9D9"/>
-            </w:tcBorders>
-          </w:tcPr>
-          <w:p>
-            <w:pPr>
-              <w:spacing w:after="40" w:before="0" w:line="240" w:lineRule="auto"/>
-            </w:pPr>
-            <w:r>
-              <w:rPr>
-                <w:rFonts w:ascii="Calibri" w:hAnsi="Calibri"/>
-                <w:sz w:val="20"/>
-                <w:color w:val="000000"/>
-              </w:rPr>
-              <w:t xml:space="preserve">[TL]</w:t>
-            </w:r>
-          </w:p>
-        </w:tc>
-        <w:tc>
-          <w:tcPr>
-            <w:tcW w:type="dxa" w:w="1296"/>
-            <w:vAlign w:val="center"/>
-            <w:shd w:fill="FFFFFF"/>
-            <w:tcMar>
-              <w:top w:w="90" w:type="dxa"/>
-              <w:bottom w:w="90" w:type="dxa"/>
-              <w:left w:w="110" w:type="dxa"/>
-              <w:right w:w="110" w:type="dxa"/>
-            </w:tcMar>
-            <w:tcBorders>
-              <w:top w:val="single" w:sz="5" w:color="D9D9D9"/>
-              <w:left w:val="single" w:sz="5" w:color="D9D9D9"/>
-              <w:bottom w:val="single" w:sz="5" w:color="D9D9D9"/>
-              <w:right w:val="single" w:sz="5" w:color="D9D9D9"/>
-            </w:tcBorders>
-          </w:tcPr>
-          <w:p>
-            <w:pPr>
-              <w:spacing w:after="40" w:before="0" w:line="240" w:lineRule="auto"/>
-            </w:pPr>
-            <w:r>
-              <w:rPr>
-                <w:rFonts w:ascii="Calibri" w:hAnsi="Calibri"/>
-                <w:sz w:val="20"/>
-                <w:color w:val="000000"/>
-              </w:rPr>
-              <w:t xml:space="preserve">[t]</w:t>
-            </w:r>
-          </w:p>
-        </w:tc>
-        <w:tc>
-          <w:tcPr>
-            <w:tcW w:type="dxa" w:w="1800"/>
-            <w:vAlign w:val="center"/>
-            <w:shd w:fill="FFFFFF"/>
-            <w:tcMar>
-              <w:top w:w="90" w:type="dxa"/>
-              <w:bottom w:w="90" w:type="dxa"/>
-              <w:left w:w="110" w:type="dxa"/>
-              <w:right w:w="110" w:type="dxa"/>
-            </w:tcMar>
-            <w:tcBorders>
-              <w:top w:val="single" w:sz="5" w:color="D9D9D9"/>
-              <w:left w:val="single" w:sz="5" w:color="D9D9D9"/>
-              <w:bottom w:val="single" w:sz="5" w:color="D9D9D9"/>
-              <w:right w:val="single" w:sz="5" w:color="D9D9D9"/>
-            </w:tcBorders>
-          </w:tcPr>
-          <w:p>
-            <w:pPr>
-              <w:spacing w:after="40" w:before="0" w:line="240" w:lineRule="auto"/>
-            </w:pPr>
-            <w:r>
-              <w:rPr>
-                <w:rFonts w:ascii="Calibri" w:hAnsi="Calibri"/>
-                <w:sz w:val="20"/>
-                <w:color w:val="000000"/>
-              </w:rPr>
-              <w:t xml:space="preserve">[t C]</w:t>
-            </w:r>
-          </w:p>
-        </w:tc>
-        <w:tc>
-          <w:tcPr>
-            <w:tcW w:type="dxa" w:w="3096"/>
-            <w:vAlign w:val="center"/>
-            <w:shd w:fill="FFFFFF"/>
-            <w:tcMar>
-              <w:top w:w="90" w:type="dxa"/>
-              <w:bottom w:w="90" w:type="dxa"/>
-              <w:left w:w="110" w:type="dxa"/>
-              <w:right w:w="110" w:type="dxa"/>
-            </w:tcMar>
-            <w:tcBorders>
-              <w:top w:val="single" w:sz="5" w:color="D9D9D9"/>
-              <w:left w:val="single" w:sz="5" w:color="D9D9D9"/>
-              <w:bottom w:val="single" w:sz="5" w:color="D9D9D9"/>
-              <w:right w:val="single" w:sz="5" w:color="D9D9D9"/>
-            </w:tcBorders>
-          </w:tcPr>
-          <w:p>
-            <w:pPr>
-              <w:spacing w:after="40" w:before="0" w:line="240" w:lineRule="auto"/>
-            </w:pPr>
-            <w:r>
-              <w:rPr>
-                <w:rFonts w:ascii="Calibri" w:hAnsi="Calibri"/>
-                <w:sz w:val="20"/>
-                <w:color w:val="000000"/>
-              </w:rPr>
-              <w:t xml:space="preserve">[Group (weight%); group (?) if unresolved]</w:t>
-            </w:r>
-          </w:p>
-        </w:tc>
-        <w:tc>
-          <w:tcPr>
-            <w:tcW w:type="dxa" w:w="1368"/>
-            <w:vAlign w:val="center"/>
-            <w:shd w:fill="FFFFFF"/>
-            <w:tcMar>
-              <w:top w:w="90" w:type="dxa"/>
-              <w:bottom w:w="90" w:type="dxa"/>
-              <w:left w:w="110" w:type="dxa"/>
-              <w:right w:w="110" w:type="dxa"/>
-            </w:tcMar>
-            <w:tcBorders>
-              <w:top w:val="single" w:sz="5" w:color="D9D9D9"/>
-              <w:left w:val="single" w:sz="5" w:color="D9D9D9"/>
-              <w:bottom w:val="single" w:sz="5" w:color="D9D9D9"/>
-              <w:right w:val="single" w:sz="5" w:color="D9D9D9"/>
-            </w:tcBorders>
-          </w:tcPr>
-          <w:p>
-            <w:pPr>
-              <w:spacing w:after="40" w:before="0" w:line="240" w:lineRule="auto"/>
-            </w:pPr>
-            <w:r>
-              <w:rPr>
-                <w:rFonts w:ascii="Calibri" w:hAnsi="Calibri"/>
-                <w:sz w:val="20"/>
-                <w:color w:val="000000"/>
-              </w:rPr>
-              <w:t xml:space="preserve">[Level]</w:t>
-            </w:r>
-          </w:p>
-        </w:tc>
-        <w:tc>
-          <w:tcPr>
-            <w:tcW w:type="dxa" w:w="4378"/>
-            <w:vAlign w:val="center"/>
-            <w:shd w:fill="FFFFFF"/>
-            <w:tcMar>
-              <w:top w:w="90" w:type="dxa"/>
-              <w:bottom w:w="90" w:type="dxa"/>
-              <w:left w:w="110" w:type="dxa"/>
-              <w:right w:w="110" w:type="dxa"/>
-            </w:tcMar>
-            <w:tcBorders>
-              <w:top w:val="single" w:sz="5" w:color="D9D9D9"/>
-              <w:left w:val="single" w:sz="5" w:color="D9D9D9"/>
-              <w:bottom w:val="single" w:sz="5" w:color="D9D9D9"/>
-              <w:right w:val="single" w:sz="5" w:color="D9D9D9"/>
-            </w:tcBorders>
-          </w:tcPr>
-          <w:p>
-            <w:pPr>
-              <w:spacing w:after="40" w:before="0" w:line="240" w:lineRule="auto"/>
-            </w:pPr>
-            <w:r>
-              <w:rPr>
-                <w:rFonts w:ascii="Calibri" w:hAnsi="Calibri"/>
-                <w:sz w:val="20"/>
-                <w:color w:val="000000"/>
-              </w:rPr>
-              <w:t xml:space="preserve">[Membership justification; weight rule and assumption; source IDs]</w:t>
-            </w:r>
-          </w:p>
-        </w:tc>
-      </w:tr>
-    </w:tbl>
-    <w:p>
-      <w:pPr>
-        <w:pStyle w:val="Heading2"/>
-        <w:spacing w:after="40" w:before="160" w:line="240" w:lineRule="auto"/>
-      </w:pPr>
-      <w:r>
-        <w:rPr>
-          <w:rFonts w:ascii="Calibri" w:hAnsi="Calibri"/>
-          <w:sz w:val="24"/>
-          <w:color w:val="000000"/>
-          <w:b/>
-        </w:rPr>
-        <w:t xml:space="preserve">Mapping sources</w:t>
-      </w:r>
-    </w:p>
-    <w:p>
-      <w:pPr>
-        <w:spacing w:after="40" w:before="0" w:line="240" w:lineRule="auto"/>
-      </w:pPr>
-      <w:r>
-        <w:rPr>
-          <w:rFonts w:ascii="Calibri" w:hAnsi="Calibri"/>
-          <w:sz w:val="21"/>
-          <w:color w:val="000000"/>
-        </w:rPr>
-        <w:t xml:space="preserve">[1] [Membership / TL source: full reference; relevant page, table or entry; link.]</w:t>
-      </w:r>
-    </w:p>
-    <w:p>
-      <w:pPr>
-        <w:spacing w:after="40" w:before="0" w:line="240" w:lineRule="auto"/>
-      </w:pPr>
-      <w:r>
-        <w:rPr>
-          <w:rFonts w:ascii="Calibri" w:hAnsi="Calibri"/>
-          <w:sz w:val="21"/>
-          <w:color w:val="000000"/>
-        </w:rPr>
-        <w:t xml:space="preserve">[2] [Weight / PPR-method source: full reference; relevant page, table or entry; link.]</w:t>
-      </w:r>
-    </w:p>
-    <w:p>
-      <w:pPr>
-        <w:spacing w:after="40" w:before="0" w:line="240" w:lineRule="auto"/>
-      </w:pPr>
-      <w:r>
-        <w:rPr>
-          <w:rFonts w:ascii="Calibri" w:hAnsi="Calibri"/>
-          <w:sz w:val="21"/>
-          <w:color w:val="000000"/>
-        </w:rPr>
-        <w:t xml:space="preserve">[Detailed mapping report, if available.]</w:t>
-      </w:r>
-    </w:p>
     <w:sectPr>
-      <w:pgSz w:w="16834" w:h="11909" w:orient="landscape"/>
+      <w:type w:val="nextPage"/>
+      <w:pgSz w:w="11909" w:h="16834"/>
       <w:pgMar w:top="936" w:right="936" w:bottom="936" w:left="936" w:header="720" w:footer="720" w:gutter="0"/>
       <w:cols w:space="720"/>
       <w:docGrid w:linePitch="360"/>

</xml_diff>